<commit_message>
docs: finaliza secao 5 com script de negociacao completo e minuta comercial (.docx e .md)
</commit_message>
<xml_diff>
--- a/docs/comercial/Proposta_Precificacao_Estrategia_Comercial.docx
+++ b/docs/comercial/Proposta_Precificacao_Estrategia_Comercial.docx
@@ -13,7 +13,7 @@
           <w:color w:val="059669"/>
           <w:sz w:val="18"/>
         </w:rPr>
-        <w:t>PLANEJAMENTO COMERCIAL &amp; VIABILIDADE DE MERCADO</w:t>
+        <w:t>PLANEJAMENTO COMERCIAL • MODELOS SAAS E PROJETO DEDICADO</w:t>
       </w:r>
     </w:p>
     <w:p>
@@ -39,9 +39,9 @@
           <w:rFonts w:ascii="Calibri" w:hAnsi="Calibri"/>
           <w:i/>
           <w:color w:val="475569"/>
-          <w:sz w:val="26"/>
+          <w:sz w:val="24"/>
         </w:rPr>
-        <w:t>Clinix — Sistema de Agendamento, Prontuário Eletrônico e Gestão Financeira</w:t>
+        <w:t>Clinix — Guia Completo: Assinatura Recorrente (SaaS) e Venda de Projeto Fechado (Não-SaaS)</w:t>
       </w:r>
     </w:p>
     <w:tbl>
@@ -52,13 +52,13 @@
         <w:tblLook w:firstColumn="1" w:firstRow="1" w:lastColumn="0" w:lastRow="0" w:noHBand="0" w:noVBand="1" w:val="04A0"/>
       </w:tblPr>
       <w:tblGrid>
-        <w:gridCol w:w="4824"/>
-        <w:gridCol w:w="4824"/>
+        <w:gridCol w:w="4896"/>
+        <w:gridCol w:w="4896"/>
       </w:tblGrid>
       <w:tr>
         <w:tc>
           <w:tcPr>
-            <w:tcW w:type="dxa" w:w="4824"/>
+            <w:tcW w:type="dxa" w:w="4896"/>
             <w:shd w:fill="F8FAFC"/>
             <w:tcMar>
               <w:top w:w="80" w:type="dxa"/>
@@ -90,7 +90,7 @@
         </w:tc>
         <w:tc>
           <w:tcPr>
-            <w:tcW w:type="dxa" w:w="4824"/>
+            <w:tcW w:type="dxa" w:w="4896"/>
             <w:shd w:fill="F8FAFC"/>
             <w:tcMar>
               <w:top w:w="80" w:type="dxa"/>
@@ -109,14 +109,14 @@
                 <w:color w:val="0F172A"/>
                 <w:sz w:val="19"/>
               </w:rPr>
-              <w:t>Objetivo:</w:t>
+              <w:t>Público:</w:t>
             </w:r>
             <w:r>
               <w:rPr>
                 <w:color w:val="475569"/>
                 <w:sz w:val="19"/>
               </w:rPr>
-              <w:t xml:space="preserve"> Precificação do Primeiro Cliente Real &amp; Modelo SaaS</w:t>
+              <w:t xml:space="preserve"> Clínicas e Profissionais Autônomos de Saúde</w:t>
             </w:r>
           </w:p>
         </w:tc>
@@ -124,7 +124,7 @@
       <w:tr>
         <w:tc>
           <w:tcPr>
-            <w:tcW w:type="dxa" w:w="4824"/>
+            <w:tcW w:type="dxa" w:w="4896"/>
             <w:shd w:fill="F8FAFC"/>
             <w:tcMar>
               <w:top w:w="80" w:type="dxa"/>
@@ -143,20 +143,20 @@
                 <w:color w:val="0F172A"/>
                 <w:sz w:val="19"/>
               </w:rPr>
-              <w:t>Modalidade:</w:t>
+              <w:t>Abordagens:</w:t>
             </w:r>
             <w:r>
               <w:rPr>
                 <w:color w:val="475569"/>
                 <w:sz w:val="19"/>
               </w:rPr>
-              <w:t xml:space="preserve"> Programa de Parceiro Fundador (Piloto)</w:t>
+              <w:t xml:space="preserve"> 1. Assinatura SaaS / 2. Projeto Fechado</w:t>
             </w:r>
           </w:p>
         </w:tc>
         <w:tc>
           <w:tcPr>
-            <w:tcW w:type="dxa" w:w="4824"/>
+            <w:tcW w:type="dxa" w:w="4896"/>
             <w:shd w:fill="F8FAFC"/>
             <w:tcMar>
               <w:top w:w="80" w:type="dxa"/>
@@ -182,7 +182,7 @@
                 <w:color w:val="475569"/>
                 <w:sz w:val="19"/>
               </w:rPr>
-              <w:t xml:space="preserve"> 1.0 — Outubro / 2026</w:t>
+              <w:t xml:space="preserve"> 2.1 (Finalizada e Completa) — Outubro / 2026</w:t>
             </w:r>
           </w:p>
         </w:tc>
@@ -218,7 +218,7 @@
           <w:color w:val="0F172A"/>
           <w:sz w:val="20"/>
         </w:rPr>
-        <w:t>A entrada de um primeiro cliente interessado representa o momento de transição de um projeto acadêmico para um produto de mercado real (Micro-SaaS). Como o projeto é desenvolvido no 2º semestre da graduação e continuará recebendo evoluções técnicas contínuas (Banco de Dados relacional, infraestrutura em nuvem e novas funcionalidades), o modelo financeiro deve atender a três objetivos estratégicos centrais:</w:t>
+        <w:t>A entrada de um primeiro cliente interessado no Clinix representa o momento de transição de um projeto acadêmico para um produto de mercado real. Na prática de negociação com consultórios e clínicas de saúde, existem dois perfis comportamentais claros:</w:t>
       </w:r>
     </w:p>
     <w:p>
@@ -233,7 +233,7 @@
           <w:color w:val="0F172A"/>
           <w:sz w:val="20"/>
         </w:rPr>
-        <w:t>1. Adesão Imediata:</w:t>
+        <w:t>1. O Perfil 'Sem Atrito' (Prefere Assinatura / SaaS):</w:t>
       </w:r>
       <w:r>
         <w:rPr>
@@ -241,7 +241,7 @@
           <w:color w:val="0F172A"/>
           <w:sz w:val="20"/>
         </w:rPr>
-        <w:t xml:space="preserve"> Eliminar atritos financeiros que causem desistência ou insegurança na cliente.</w:t>
+        <w:t xml:space="preserve"> Profissionais autônomos ou em início de carreira que preferem custo inicial zero ou mínimo, não querem se preocupar com servidores, backups ou manutenção técnica e valorizam pagar uma mensalidade leve e acessível.</w:t>
       </w:r>
     </w:p>
     <w:p>
@@ -256,7 +256,7 @@
           <w:color w:val="0F172A"/>
           <w:sz w:val="20"/>
         </w:rPr>
-        <w:t>2. Receita Recorrente Previsível:</w:t>
+        <w:t>2. O Perfil 'Proprietário' (Prefere Projeto Dedicado / Não-SaaS):</w:t>
       </w:r>
       <w:r>
         <w:rPr>
@@ -264,45 +264,7 @@
           <w:color w:val="0F172A"/>
           <w:sz w:val="20"/>
         </w:rPr>
-        <w:t xml:space="preserve"> Cobrir custos de infraestrutura e recompensar o tempo investido em suporte e evolução.</w:t>
-      </w:r>
-    </w:p>
-    <w:p>
-      <w:pPr>
-        <w:pStyle w:val="ListBullet"/>
-        <w:spacing w:after="60" w:line="276" w:lineRule="auto"/>
-      </w:pPr>
-      <w:r>
-        <w:rPr>
-          <w:rFonts w:ascii="Calibri" w:hAnsi="Calibri"/>
-          <w:b/>
-          <w:color w:val="0F172A"/>
-          <w:sz w:val="20"/>
-        </w:rPr>
-        <w:t>3. Validação no Mundo Real:</w:t>
-      </w:r>
-      <w:r>
-        <w:rPr>
-          <w:rFonts w:ascii="Calibri" w:hAnsi="Calibri"/>
-          <w:color w:val="0F172A"/>
-          <w:sz w:val="20"/>
-        </w:rPr>
-        <w:t xml:space="preserve"> Transformar a cliente no seu laboratório prático e case de referência para atrair novos consultórios.</w:t>
-      </w:r>
-    </w:p>
-    <w:p>
-      <w:pPr>
-        <w:keepNext/>
-        <w:spacing w:before="280" w:after="80"/>
-      </w:pPr>
-      <w:r>
-        <w:rPr>
-          <w:rFonts w:ascii="Calibri" w:hAnsi="Calibri"/>
-          <w:b/>
-          <w:color w:val="065F46"/>
-          <w:sz w:val="28"/>
-        </w:rPr>
-        <w:t>2. Por que NÃO Vender por Valor Único Fechado?</w:t>
+        <w:t xml:space="preserve"> Clínicas mais estruturadas ou profissionais que têm aversão a mensalidades eternas. Querem pagar pelo desenvolvimento/licença do software, ter a solução instalada para a clínica e contar com uma garantia técnica contratual.</w:t>
       </w:r>
     </w:p>
     <w:p>
@@ -321,7 +283,7 @@
           <w:color w:val="B45309"/>
           <w:sz w:val="19"/>
         </w:rPr>
-        <w:t xml:space="preserve">💡 Atenção: </w:t>
+        <w:t xml:space="preserve">💡 O Poder da Ancoragem Comercial (A Técnica das Duas Portas): </w:t>
       </w:r>
       <w:r>
         <w:rPr>
@@ -329,7 +291,22 @@
           <w:color w:val="0F172A"/>
           <w:sz w:val="19"/>
         </w:rPr>
-        <w:t>Muitos desenvolvedores iniciantes cogitam cobrar um valor único (ex.: 'vender o sistema por R$ 2.000 à vista'). No setor de saúde, isso é um erro grave: você assume suporte infinito de graça e perde a oportunidade de criar um negócio recorrente escalável.</w:t>
+        <w:t>Ao ter os dois formatos na mesa, você aplica a consagrada técnica de ancoragem: se a cliente achar o Projeto Fechado (R$ 2.400) um valor alto para desembolsar à vista, a Assinatura (R$ 119/mês) parece baratíssima e irresistível; se ela declarar que não quer mensalidades fixas para o resto da vida, você não perde a venda e fecha imediatamente o Projeto Fechado com entrada e parcelas por entrega!</w:t>
+      </w:r>
+    </w:p>
+    <w:p>
+      <w:pPr>
+        <w:keepNext/>
+        <w:spacing w:before="280" w:after="80"/>
+      </w:pPr>
+      <w:r>
+        <w:rPr>
+          <w:rFonts w:ascii="Calibri" w:hAnsi="Calibri"/>
+          <w:b/>
+          <w:color w:val="065F46"/>
+          <w:sz w:val="28"/>
+        </w:rPr>
+        <w:t>2. Matriz Comparativa: SaaS (Assinatura) vs. Não-SaaS (Projeto Fechado)</w:t>
       </w:r>
     </w:p>
     <w:tbl>
@@ -340,8 +317,1252 @@
         <w:tblLook w:firstColumn="1" w:firstRow="1" w:lastColumn="0" w:lastRow="0" w:noHBand="0" w:noVBand="1" w:val="04A0"/>
       </w:tblPr>
       <w:tblGrid>
-        <w:gridCol w:w="4824"/>
-        <w:gridCol w:w="4824"/>
+        <w:gridCol w:w="3264"/>
+        <w:gridCol w:w="3264"/>
+        <w:gridCol w:w="3264"/>
+      </w:tblGrid>
+      <w:tr>
+        <w:tc>
+          <w:tcPr>
+            <w:tcW w:type="dxa" w:w="2592"/>
+            <w:shd w:fill="065F46"/>
+            <w:tcMar>
+              <w:top w:w="100" w:type="dxa"/>
+              <w:bottom w:w="100" w:type="dxa"/>
+              <w:left w:w="100" w:type="dxa"/>
+              <w:right w:w="100" w:type="dxa"/>
+            </w:tcMar>
+          </w:tcPr>
+          <w:p>
+            <w:r>
+              <w:rPr>
+                <w:b/>
+                <w:color w:val="FFFFFF"/>
+                <w:sz w:val="18"/>
+              </w:rPr>
+              <w:t>Critério de Avaliação</w:t>
+            </w:r>
+          </w:p>
+        </w:tc>
+        <w:tc>
+          <w:tcPr>
+            <w:tcW w:type="dxa" w:w="3600"/>
+            <w:shd w:fill="065F46"/>
+            <w:tcMar>
+              <w:top w:w="100" w:type="dxa"/>
+              <w:bottom w:w="100" w:type="dxa"/>
+              <w:left w:w="100" w:type="dxa"/>
+              <w:right w:w="100" w:type="dxa"/>
+            </w:tcMar>
+          </w:tcPr>
+          <w:p>
+            <w:r>
+              <w:rPr>
+                <w:b/>
+                <w:color w:val="FFFFFF"/>
+                <w:sz w:val="18"/>
+              </w:rPr>
+              <w:t>Modelo A: Assinatura (SaaS)</w:t>
+            </w:r>
+          </w:p>
+        </w:tc>
+        <w:tc>
+          <w:tcPr>
+            <w:tcW w:type="dxa" w:w="3600"/>
+            <w:shd w:fill="065F46"/>
+            <w:tcMar>
+              <w:top w:w="100" w:type="dxa"/>
+              <w:bottom w:w="100" w:type="dxa"/>
+              <w:left w:w="100" w:type="dxa"/>
+              <w:right w:w="100" w:type="dxa"/>
+            </w:tcMar>
+          </w:tcPr>
+          <w:p>
+            <w:r>
+              <w:rPr>
+                <w:b/>
+                <w:color w:val="FFFFFF"/>
+                <w:sz w:val="18"/>
+              </w:rPr>
+              <w:t>Modelo B: Projeto Fechado (Não-SaaS)</w:t>
+            </w:r>
+          </w:p>
+        </w:tc>
+      </w:tr>
+      <w:tr>
+        <w:tc>
+          <w:tcPr>
+            <w:tcW w:type="dxa" w:w="2592"/>
+            <w:shd w:fill="F8FAFC"/>
+            <w:tcMar>
+              <w:top w:w="80" w:type="dxa"/>
+              <w:bottom w:w="80" w:type="dxa"/>
+              <w:left w:w="100" w:type="dxa"/>
+              <w:right w:w="100" w:type="dxa"/>
+            </w:tcMar>
+          </w:tcPr>
+          <w:p>
+            <w:r>
+              <w:rPr>
+                <w:b/>
+                <w:color w:val="0F172A"/>
+                <w:sz w:val="18"/>
+              </w:rPr>
+              <w:t>Investimento Inicial</w:t>
+            </w:r>
+          </w:p>
+        </w:tc>
+        <w:tc>
+          <w:tcPr>
+            <w:tcW w:type="dxa" w:w="3600"/>
+            <w:shd w:fill="F8FAFC"/>
+            <w:tcMar>
+              <w:top w:w="80" w:type="dxa"/>
+              <w:bottom w:w="80" w:type="dxa"/>
+              <w:left w:w="100" w:type="dxa"/>
+              <w:right w:w="100" w:type="dxa"/>
+            </w:tcMar>
+          </w:tcPr>
+          <w:p>
+            <w:r>
+              <w:rPr>
+                <w:color w:val="475569"/>
+                <w:sz w:val="18"/>
+              </w:rPr>
+              <w:t>R$ 0,00 (30 dias de piloto gratuito)</w:t>
+            </w:r>
+          </w:p>
+        </w:tc>
+        <w:tc>
+          <w:tcPr>
+            <w:tcW w:type="dxa" w:w="3600"/>
+            <w:shd w:fill="F8FAFC"/>
+            <w:tcMar>
+              <w:top w:w="80" w:type="dxa"/>
+              <w:bottom w:w="80" w:type="dxa"/>
+              <w:left w:w="100" w:type="dxa"/>
+              <w:right w:w="100" w:type="dxa"/>
+            </w:tcMar>
+          </w:tcPr>
+          <w:p>
+            <w:r>
+              <w:rPr>
+                <w:color w:val="475569"/>
+                <w:sz w:val="18"/>
+              </w:rPr>
+              <w:t>R$ 2.000,00 a R$ 2.800,00 (ideal: R$ 2.400,00)</w:t>
+            </w:r>
+          </w:p>
+        </w:tc>
+      </w:tr>
+      <w:tr>
+        <w:tc>
+          <w:tcPr>
+            <w:tcW w:type="dxa" w:w="2592"/>
+            <w:shd w:fill="FFFFFF"/>
+            <w:tcMar>
+              <w:top w:w="80" w:type="dxa"/>
+              <w:bottom w:w="80" w:type="dxa"/>
+              <w:left w:w="100" w:type="dxa"/>
+              <w:right w:w="100" w:type="dxa"/>
+            </w:tcMar>
+          </w:tcPr>
+          <w:p>
+            <w:r>
+              <w:rPr>
+                <w:b/>
+                <w:color w:val="0F172A"/>
+                <w:sz w:val="18"/>
+              </w:rPr>
+              <w:t>Custo Recorrente Mensal</w:t>
+            </w:r>
+          </w:p>
+        </w:tc>
+        <w:tc>
+          <w:tcPr>
+            <w:tcW w:type="dxa" w:w="3600"/>
+            <w:shd w:fill="FFFFFF"/>
+            <w:tcMar>
+              <w:top w:w="80" w:type="dxa"/>
+              <w:bottom w:w="80" w:type="dxa"/>
+              <w:left w:w="100" w:type="dxa"/>
+              <w:right w:w="100" w:type="dxa"/>
+            </w:tcMar>
+          </w:tcPr>
+          <w:p>
+            <w:r>
+              <w:rPr>
+                <w:color w:val="475569"/>
+                <w:sz w:val="18"/>
+              </w:rPr>
+              <w:t>R$ 97,00 a R$ 127,00 / mês (ideal: R$ 119)</w:t>
+            </w:r>
+          </w:p>
+        </w:tc>
+        <w:tc>
+          <w:tcPr>
+            <w:tcW w:type="dxa" w:w="3600"/>
+            <w:shd w:fill="FFFFFF"/>
+            <w:tcMar>
+              <w:top w:w="80" w:type="dxa"/>
+              <w:bottom w:w="80" w:type="dxa"/>
+              <w:left w:w="100" w:type="dxa"/>
+              <w:right w:w="100" w:type="dxa"/>
+            </w:tcMar>
+          </w:tcPr>
+          <w:p>
+            <w:r>
+              <w:rPr>
+                <w:color w:val="475569"/>
+                <w:sz w:val="18"/>
+              </w:rPr>
+              <w:t>R$ 0,00 (ou R$ 80 a R$ 120/mês para suporte opcional)</w:t>
+            </w:r>
+          </w:p>
+        </w:tc>
+      </w:tr>
+      <w:tr>
+        <w:tc>
+          <w:tcPr>
+            <w:tcW w:type="dxa" w:w="2592"/>
+            <w:shd w:fill="F8FAFC"/>
+            <w:tcMar>
+              <w:top w:w="80" w:type="dxa"/>
+              <w:bottom w:w="80" w:type="dxa"/>
+              <w:left w:w="100" w:type="dxa"/>
+              <w:right w:w="100" w:type="dxa"/>
+            </w:tcMar>
+          </w:tcPr>
+          <w:p>
+            <w:r>
+              <w:rPr>
+                <w:b/>
+                <w:color w:val="0F172A"/>
+                <w:sz w:val="18"/>
+              </w:rPr>
+              <w:t>Infraestrutura &amp; Nuvem</w:t>
+            </w:r>
+          </w:p>
+        </w:tc>
+        <w:tc>
+          <w:tcPr>
+            <w:tcW w:type="dxa" w:w="3600"/>
+            <w:shd w:fill="F8FAFC"/>
+            <w:tcMar>
+              <w:top w:w="80" w:type="dxa"/>
+              <w:bottom w:w="80" w:type="dxa"/>
+              <w:left w:w="100" w:type="dxa"/>
+              <w:right w:w="100" w:type="dxa"/>
+            </w:tcMar>
+          </w:tcPr>
+          <w:p>
+            <w:r>
+              <w:rPr>
+                <w:color w:val="475569"/>
+                <w:sz w:val="18"/>
+              </w:rPr>
+              <w:t>Hospedagem sob responsabilidade do desenvolvedor</w:t>
+            </w:r>
+          </w:p>
+        </w:tc>
+        <w:tc>
+          <w:tcPr>
+            <w:tcW w:type="dxa" w:w="3600"/>
+            <w:shd w:fill="F8FAFC"/>
+            <w:tcMar>
+              <w:top w:w="80" w:type="dxa"/>
+              <w:bottom w:w="80" w:type="dxa"/>
+              <w:left w:w="100" w:type="dxa"/>
+              <w:right w:w="100" w:type="dxa"/>
+            </w:tcMar>
+          </w:tcPr>
+          <w:p>
+            <w:r>
+              <w:rPr>
+                <w:color w:val="475569"/>
+                <w:sz w:val="18"/>
+              </w:rPr>
+              <w:t>Servidor ou nuvem no nome/cartão da própria clínica</w:t>
+            </w:r>
+          </w:p>
+        </w:tc>
+      </w:tr>
+      <w:tr>
+        <w:tc>
+          <w:tcPr>
+            <w:tcW w:type="dxa" w:w="2592"/>
+            <w:shd w:fill="FFFFFF"/>
+            <w:tcMar>
+              <w:top w:w="80" w:type="dxa"/>
+              <w:bottom w:w="80" w:type="dxa"/>
+              <w:left w:w="100" w:type="dxa"/>
+              <w:right w:w="100" w:type="dxa"/>
+            </w:tcMar>
+          </w:tcPr>
+          <w:p>
+            <w:r>
+              <w:rPr>
+                <w:b/>
+                <w:color w:val="0F172A"/>
+                <w:sz w:val="18"/>
+              </w:rPr>
+              <w:t>Garantia &amp; Suporte</w:t>
+            </w:r>
+          </w:p>
+        </w:tc>
+        <w:tc>
+          <w:tcPr>
+            <w:tcW w:type="dxa" w:w="3600"/>
+            <w:shd w:fill="FFFFFF"/>
+            <w:tcMar>
+              <w:top w:w="80" w:type="dxa"/>
+              <w:bottom w:w="80" w:type="dxa"/>
+              <w:left w:w="100" w:type="dxa"/>
+              <w:right w:w="100" w:type="dxa"/>
+            </w:tcMar>
+          </w:tcPr>
+          <w:p>
+            <w:r>
+              <w:rPr>
+                <w:color w:val="475569"/>
+                <w:sz w:val="18"/>
+              </w:rPr>
+              <w:t>Suporte contínuo incluso na mensalidade</w:t>
+            </w:r>
+          </w:p>
+        </w:tc>
+        <w:tc>
+          <w:tcPr>
+            <w:tcW w:type="dxa" w:w="3600"/>
+            <w:shd w:fill="FFFFFF"/>
+            <w:tcMar>
+              <w:top w:w="80" w:type="dxa"/>
+              <w:bottom w:w="80" w:type="dxa"/>
+              <w:left w:w="100" w:type="dxa"/>
+              <w:right w:w="100" w:type="dxa"/>
+            </w:tcMar>
+          </w:tcPr>
+          <w:p>
+            <w:r>
+              <w:rPr>
+                <w:color w:val="475569"/>
+                <w:sz w:val="18"/>
+              </w:rPr>
+              <w:t>90 dias de garantia técnica total contra bugs inclusa</w:t>
+            </w:r>
+          </w:p>
+        </w:tc>
+      </w:tr>
+      <w:tr>
+        <w:tc>
+          <w:tcPr>
+            <w:tcW w:type="dxa" w:w="2592"/>
+            <w:shd w:fill="F8FAFC"/>
+            <w:tcMar>
+              <w:top w:w="80" w:type="dxa"/>
+              <w:bottom w:w="80" w:type="dxa"/>
+              <w:left w:w="100" w:type="dxa"/>
+              <w:right w:w="100" w:type="dxa"/>
+            </w:tcMar>
+          </w:tcPr>
+          <w:p>
+            <w:r>
+              <w:rPr>
+                <w:b/>
+                <w:color w:val="0F172A"/>
+                <w:sz w:val="18"/>
+              </w:rPr>
+              <w:t>Evolução Tecnológica</w:t>
+            </w:r>
+          </w:p>
+        </w:tc>
+        <w:tc>
+          <w:tcPr>
+            <w:tcW w:type="dxa" w:w="3600"/>
+            <w:shd w:fill="F8FAFC"/>
+            <w:tcMar>
+              <w:top w:w="80" w:type="dxa"/>
+              <w:bottom w:w="80" w:type="dxa"/>
+              <w:left w:w="100" w:type="dxa"/>
+              <w:right w:w="100" w:type="dxa"/>
+            </w:tcMar>
+          </w:tcPr>
+          <w:p>
+            <w:r>
+              <w:rPr>
+                <w:color w:val="475569"/>
+                <w:sz w:val="18"/>
+              </w:rPr>
+              <w:t>Recebe automaticamente todas as novas versões lançadas</w:t>
+            </w:r>
+          </w:p>
+        </w:tc>
+        <w:tc>
+          <w:tcPr>
+            <w:tcW w:type="dxa" w:w="3600"/>
+            <w:shd w:fill="F8FAFC"/>
+            <w:tcMar>
+              <w:top w:w="80" w:type="dxa"/>
+              <w:bottom w:w="80" w:type="dxa"/>
+              <w:left w:w="100" w:type="dxa"/>
+              <w:right w:w="100" w:type="dxa"/>
+            </w:tcMar>
+          </w:tcPr>
+          <w:p>
+            <w:r>
+              <w:rPr>
+                <w:color w:val="475569"/>
+                <w:sz w:val="18"/>
+              </w:rPr>
+              <w:t>Escopo fechado (novas funções são orçadas à parte)</w:t>
+            </w:r>
+          </w:p>
+        </w:tc>
+      </w:tr>
+      <w:tr>
+        <w:tc>
+          <w:tcPr>
+            <w:tcW w:type="dxa" w:w="2592"/>
+            <w:shd w:fill="FFFFFF"/>
+            <w:tcMar>
+              <w:top w:w="80" w:type="dxa"/>
+              <w:bottom w:w="80" w:type="dxa"/>
+              <w:left w:w="100" w:type="dxa"/>
+              <w:right w:w="100" w:type="dxa"/>
+            </w:tcMar>
+          </w:tcPr>
+          <w:p>
+            <w:r>
+              <w:rPr>
+                <w:b/>
+                <w:color w:val="0F172A"/>
+                <w:sz w:val="18"/>
+              </w:rPr>
+              <w:t>Perfil Típico de Cliente</w:t>
+            </w:r>
+          </w:p>
+        </w:tc>
+        <w:tc>
+          <w:tcPr>
+            <w:tcW w:type="dxa" w:w="3600"/>
+            <w:shd w:fill="FFFFFF"/>
+            <w:tcMar>
+              <w:top w:w="80" w:type="dxa"/>
+              <w:bottom w:w="80" w:type="dxa"/>
+              <w:left w:w="100" w:type="dxa"/>
+              <w:right w:w="100" w:type="dxa"/>
+            </w:tcMar>
+          </w:tcPr>
+          <w:p>
+            <w:r>
+              <w:rPr>
+                <w:color w:val="475569"/>
+                <w:sz w:val="18"/>
+              </w:rPr>
+              <w:t>Psicólogos, nutricionistas e autônomos</w:t>
+            </w:r>
+          </w:p>
+        </w:tc>
+        <w:tc>
+          <w:tcPr>
+            <w:tcW w:type="dxa" w:w="3600"/>
+            <w:shd w:fill="FFFFFF"/>
+            <w:tcMar>
+              <w:top w:w="80" w:type="dxa"/>
+              <w:bottom w:w="80" w:type="dxa"/>
+              <w:left w:w="100" w:type="dxa"/>
+              <w:right w:w="100" w:type="dxa"/>
+            </w:tcMar>
+          </w:tcPr>
+          <w:p>
+            <w:r>
+              <w:rPr>
+                <w:color w:val="475569"/>
+                <w:sz w:val="18"/>
+              </w:rPr>
+              <w:t>Clínicas médicas, odontológicas ou sociedades estruturadas</w:t>
+            </w:r>
+          </w:p>
+        </w:tc>
+      </w:tr>
+    </w:tbl>
+    <w:p>
+      <w:pPr>
+        <w:spacing w:after="80"/>
+      </w:pPr>
+    </w:p>
+    <w:p>
+      <w:pPr>
+        <w:spacing w:after="80" w:line="276" w:lineRule="auto"/>
+      </w:pPr>
+      <w:r>
+        <w:rPr>
+          <w:rFonts w:ascii="Calibri" w:hAnsi="Calibri"/>
+          <w:color w:val="0F172A"/>
+          <w:sz w:val="20"/>
+        </w:rPr>
+        <w:t>Retorno sobre o Investimento (ROI) para a Clínica: Em consultórios particulares, o valor médio de uma consulta varia entre R$ 150 e R$ 300. O módulo de confirmações e lembretes via WhatsApp reduz as faltas de pacientes em até 40%. Se o sistema evitar que 1 único paciente falte no mês inteiro, a clínica já recuperou mais dinheiro do que o custo de qualquer um dos modelos!</w:t>
+      </w:r>
+    </w:p>
+    <w:p>
+      <w:pPr>
+        <w:keepNext/>
+        <w:spacing w:before="280" w:after="80"/>
+      </w:pPr>
+      <w:r>
+        <w:rPr>
+          <w:rFonts w:ascii="Calibri" w:hAnsi="Calibri"/>
+          <w:b/>
+          <w:color w:val="065F46"/>
+          <w:sz w:val="28"/>
+        </w:rPr>
+        <w:t>3. Detalhamento do Modelo Não-SaaS (Projeto Dedicado / Licença)</w:t>
+      </w:r>
+    </w:p>
+    <w:p>
+      <w:pPr>
+        <w:spacing w:after="80" w:line="276" w:lineRule="auto"/>
+      </w:pPr>
+      <w:r>
+        <w:rPr>
+          <w:rFonts w:ascii="Calibri" w:hAnsi="Calibri"/>
+          <w:color w:val="0F172A"/>
+          <w:sz w:val="20"/>
+        </w:rPr>
+        <w:t>Neste modelo, o Clinix é contratado como o desenvolvimento e implantação de uma solução personalizada para o consultório da cliente.</w:t>
+      </w:r>
+    </w:p>
+    <w:p>
+      <w:pPr>
+        <w:keepNext/>
+        <w:spacing w:before="200" w:after="60"/>
+      </w:pPr>
+      <w:r>
+        <w:rPr>
+          <w:rFonts w:ascii="Calibri" w:hAnsi="Calibri"/>
+          <w:b/>
+          <w:color w:val="059669"/>
+          <w:sz w:val="23"/>
+        </w:rPr>
+        <w:t>3.1 Precificação Recomendada:</w:t>
+      </w:r>
+    </w:p>
+    <w:p>
+      <w:pPr>
+        <w:pStyle w:val="ListBullet"/>
+        <w:spacing w:after="60" w:line="276" w:lineRule="auto"/>
+      </w:pPr>
+      <w:r>
+        <w:rPr>
+          <w:rFonts w:ascii="Calibri" w:hAnsi="Calibri"/>
+          <w:b/>
+          <w:color w:val="0F172A"/>
+          <w:sz w:val="20"/>
+        </w:rPr>
+        <w:t>Faixa de Preço para Primeiro Projeto:</w:t>
+      </w:r>
+      <w:r>
+        <w:rPr>
+          <w:rFonts w:ascii="Calibri" w:hAnsi="Calibri"/>
+          <w:color w:val="0F172A"/>
+          <w:sz w:val="20"/>
+        </w:rPr>
+        <w:t xml:space="preserve"> R$ 2.000,00 a R$ 2.800,00 (Valor ideal de mercado recomendado: R$ 2.400,00).</w:t>
+      </w:r>
+    </w:p>
+    <w:p>
+      <w:pPr>
+        <w:pStyle w:val="ListBullet"/>
+        <w:spacing w:after="60" w:line="276" w:lineRule="auto"/>
+      </w:pPr>
+      <w:r>
+        <w:rPr>
+          <w:rFonts w:ascii="Calibri" w:hAnsi="Calibri"/>
+          <w:b/>
+          <w:color w:val="0F172A"/>
+          <w:sz w:val="20"/>
+        </w:rPr>
+        <w:t>Benchmark Comparativo:</w:t>
+      </w:r>
+      <w:r>
+        <w:rPr>
+          <w:rFonts w:ascii="Calibri" w:hAnsi="Calibri"/>
+          <w:color w:val="0F172A"/>
+          <w:sz w:val="20"/>
+        </w:rPr>
+        <w:t xml:space="preserve"> Fábricas de software e agências cobram entre R$ 6.000,00 e R$ 12.000,00 por um sistema com agenda, prontuário LGPD e financeiro.</w:t>
+      </w:r>
+    </w:p>
+    <w:p>
+      <w:pPr>
+        <w:keepNext/>
+        <w:spacing w:before="200" w:after="60"/>
+      </w:pPr>
+      <w:r>
+        <w:rPr>
+          <w:rFonts w:ascii="Calibri" w:hAnsi="Calibri"/>
+          <w:b/>
+          <w:color w:val="059669"/>
+          <w:sz w:val="23"/>
+        </w:rPr>
+        <w:t>3.2 Cronograma de Pagamento por Marcos de Entrega (Milestones):</w:t>
+      </w:r>
+    </w:p>
+    <w:p>
+      <w:pPr>
+        <w:spacing w:after="80" w:line="276" w:lineRule="auto"/>
+      </w:pPr>
+      <w:r>
+        <w:rPr>
+          <w:rFonts w:ascii="Calibri" w:hAnsi="Calibri"/>
+          <w:color w:val="0F172A"/>
+          <w:sz w:val="20"/>
+        </w:rPr>
+        <w:t>Nunca receba 100% no final. Divida o valor em três etapas para garantir segurança financeira mútua:</w:t>
+      </w:r>
+    </w:p>
+    <w:p>
+      <w:pPr>
+        <w:pStyle w:val="ListBullet"/>
+        <w:spacing w:after="60" w:line="276" w:lineRule="auto"/>
+      </w:pPr>
+      <w:r>
+        <w:rPr>
+          <w:rFonts w:ascii="Calibri" w:hAnsi="Calibri"/>
+          <w:b/>
+          <w:color w:val="0F172A"/>
+          <w:sz w:val="20"/>
+        </w:rPr>
+        <w:t>Entrada (40% — R$ 960,00):</w:t>
+      </w:r>
+      <w:r>
+        <w:rPr>
+          <w:rFonts w:ascii="Calibri" w:hAnsi="Calibri"/>
+          <w:color w:val="0F172A"/>
+          <w:sz w:val="20"/>
+        </w:rPr>
+        <w:t xml:space="preserve"> Assinatura do acordo, levantamento dos horários/serviços, personalização visual e configuração do banco de dados dedicado.</w:t>
+      </w:r>
+    </w:p>
+    <w:p>
+      <w:pPr>
+        <w:pStyle w:val="ListBullet"/>
+        <w:spacing w:after="60" w:line="276" w:lineRule="auto"/>
+      </w:pPr>
+      <w:r>
+        <w:rPr>
+          <w:rFonts w:ascii="Calibri" w:hAnsi="Calibri"/>
+          <w:b/>
+          <w:color w:val="0F172A"/>
+          <w:sz w:val="20"/>
+        </w:rPr>
+        <w:t>Intermediária (30% — R$ 720,00):</w:t>
+      </w:r>
+      <w:r>
+        <w:rPr>
+          <w:rFonts w:ascii="Calibri" w:hAnsi="Calibri"/>
+          <w:color w:val="0F172A"/>
+          <w:sz w:val="20"/>
+        </w:rPr>
+        <w:t xml:space="preserve"> Demonstração do sistema já configurado e populado com a base de dados reais da clínica, validando fluxos clínicos.</w:t>
+      </w:r>
+    </w:p>
+    <w:p>
+      <w:pPr>
+        <w:pStyle w:val="ListBullet"/>
+        <w:spacing w:after="60" w:line="276" w:lineRule="auto"/>
+      </w:pPr>
+      <w:r>
+        <w:rPr>
+          <w:rFonts w:ascii="Calibri" w:hAnsi="Calibri"/>
+          <w:b/>
+          <w:color w:val="0F172A"/>
+          <w:sz w:val="20"/>
+        </w:rPr>
+        <w:t>Entrega Final (30% — R$ 720,00):</w:t>
+      </w:r>
+      <w:r>
+        <w:rPr>
+          <w:rFonts w:ascii="Calibri" w:hAnsi="Calibri"/>
+          <w:color w:val="0F172A"/>
+          <w:sz w:val="20"/>
+        </w:rPr>
+        <w:t xml:space="preserve"> Treinamento presencial/remoto da equipe, homologação final e início do uso oficial.</w:t>
+      </w:r>
+    </w:p>
+    <w:p>
+      <w:pPr>
+        <w:spacing w:after="80" w:line="276" w:lineRule="auto"/>
+      </w:pPr>
+      <w:r>
+        <w:rPr>
+          <w:rFonts w:ascii="Calibri" w:hAnsi="Calibri"/>
+          <w:color w:val="0F172A"/>
+          <w:sz w:val="20"/>
+        </w:rPr>
+        <w:t>Alternativa comercial: Parcelamento facilitado em até 4x no cartão de crédito ou boleto bancário sem juros.</w:t>
+      </w:r>
+    </w:p>
+    <w:p>
+      <w:pPr>
+        <w:keepNext/>
+        <w:spacing w:before="200" w:after="60"/>
+      </w:pPr>
+      <w:r>
+        <w:rPr>
+          <w:rFonts w:ascii="Calibri" w:hAnsi="Calibri"/>
+          <w:b/>
+          <w:color w:val="059669"/>
+          <w:sz w:val="23"/>
+        </w:rPr>
+        <w:t>3.3 O que está Incluso no Escopo do Projeto:</w:t>
+      </w:r>
+    </w:p>
+    <w:p>
+      <w:pPr>
+        <w:pStyle w:val="ListBullet"/>
+        <w:spacing w:after="60" w:line="276" w:lineRule="auto"/>
+      </w:pPr>
+      <w:r>
+        <w:rPr>
+          <w:rFonts w:ascii="Calibri" w:hAnsi="Calibri"/>
+          <w:color w:val="0F172A"/>
+          <w:sz w:val="20"/>
+        </w:rPr>
+        <w:t xml:space="preserve"> Implantação e parametrização dos 5 módulos completos (Agenda Inteligente, Base de Pacientes, Prontuário com Histórico Imutável, Notificações WhatsApp e Gestão Financeira);</w:t>
+      </w:r>
+    </w:p>
+    <w:p>
+      <w:pPr>
+        <w:pStyle w:val="ListBullet"/>
+        <w:spacing w:after="60" w:line="276" w:lineRule="auto"/>
+      </w:pPr>
+      <w:r>
+        <w:rPr>
+          <w:rFonts w:ascii="Calibri" w:hAnsi="Calibri"/>
+          <w:color w:val="0F172A"/>
+          <w:sz w:val="20"/>
+        </w:rPr>
+        <w:t xml:space="preserve"> Importação inicial da base de pacientes e tabela de procedimentos da clínica;</w:t>
+      </w:r>
+    </w:p>
+    <w:p>
+      <w:pPr>
+        <w:pStyle w:val="ListBullet"/>
+        <w:spacing w:after="60" w:line="276" w:lineRule="auto"/>
+      </w:pPr>
+      <w:r>
+        <w:rPr>
+          <w:rFonts w:ascii="Calibri" w:hAnsi="Calibri"/>
+          <w:color w:val="0F172A"/>
+          <w:sz w:val="20"/>
+        </w:rPr>
+        <w:t xml:space="preserve"> Treinamento operacional para o profissional e atendente/secretária;</w:t>
+      </w:r>
+    </w:p>
+    <w:p>
+      <w:pPr>
+        <w:pStyle w:val="ListBullet"/>
+        <w:spacing w:after="60" w:line="276" w:lineRule="auto"/>
+      </w:pPr>
+      <w:r>
+        <w:rPr>
+          <w:rFonts w:ascii="Calibri" w:hAnsi="Calibri"/>
+          <w:color w:val="0F172A"/>
+          <w:sz w:val="20"/>
+        </w:rPr>
+        <w:t xml:space="preserve"> Garantia Técnica de 90 Dias com suporte prioritário para correção de bugs sem custo adicional.</w:t>
+      </w:r>
+    </w:p>
+    <w:p>
+      <w:pPr>
+        <w:keepNext/>
+        <w:spacing w:before="200" w:after="60"/>
+      </w:pPr>
+      <w:r>
+        <w:rPr>
+          <w:rFonts w:ascii="Calibri" w:hAnsi="Calibri"/>
+          <w:b/>
+          <w:color w:val="059669"/>
+          <w:sz w:val="23"/>
+        </w:rPr>
+        <w:t>3.4 Pós-Garantia (Como Continuar Ganhando Dinheiro no Modelo Não-SaaS):</w:t>
+      </w:r>
+    </w:p>
+    <w:p>
+      <w:pPr>
+        <w:spacing w:after="80" w:line="276" w:lineRule="auto"/>
+      </w:pPr>
+      <w:r>
+        <w:rPr>
+          <w:rFonts w:ascii="Calibri" w:hAnsi="Calibri"/>
+          <w:color w:val="0F172A"/>
+          <w:sz w:val="20"/>
+        </w:rPr>
+        <w:t>Após o término dos 90 dias de garantia, você mantém duas fontes contínuas de receita:</w:t>
+      </w:r>
+    </w:p>
+    <w:p>
+      <w:pPr>
+        <w:pStyle w:val="ListBullet"/>
+        <w:spacing w:after="60" w:line="276" w:lineRule="auto"/>
+      </w:pPr>
+      <w:r>
+        <w:rPr>
+          <w:rFonts w:ascii="Calibri" w:hAnsi="Calibri"/>
+          <w:b/>
+          <w:color w:val="0F172A"/>
+          <w:sz w:val="20"/>
+        </w:rPr>
+        <w:t>Contrato de Sustentação Opcional:</w:t>
+      </w:r>
+      <w:r>
+        <w:rPr>
+          <w:rFonts w:ascii="Calibri" w:hAnsi="Calibri"/>
+          <w:color w:val="0F172A"/>
+          <w:sz w:val="20"/>
+        </w:rPr>
+        <w:t xml:space="preserve"> R$ 80,00 a R$ 120,00 / mês. Cobre monitoramento de integridade, rotina de backup diário na nuvem e suporte técnico a dúvidas operacionais.</w:t>
+      </w:r>
+    </w:p>
+    <w:p>
+      <w:pPr>
+        <w:pStyle w:val="ListBullet"/>
+        <w:spacing w:after="60" w:line="276" w:lineRule="auto"/>
+      </w:pPr>
+      <w:r>
+        <w:rPr>
+          <w:rFonts w:ascii="Calibri" w:hAnsi="Calibri"/>
+          <w:b/>
+          <w:color w:val="0F172A"/>
+          <w:sz w:val="20"/>
+        </w:rPr>
+        <w:t>Banco de Horas para Novas Telas:</w:t>
+      </w:r>
+      <w:r>
+        <w:rPr>
+          <w:rFonts w:ascii="Calibri" w:hAnsi="Calibri"/>
+          <w:color w:val="0F172A"/>
+          <w:sz w:val="20"/>
+        </w:rPr>
+        <w:t xml:space="preserve"> R$ 60,00 a R$ 90,00 / hora. Caso a cliente queira relatórios novos, atestados personalizados ou integrações futuras.</w:t>
+      </w:r>
+    </w:p>
+    <w:p>
+      <w:pPr>
+        <w:keepNext/>
+        <w:spacing w:before="280" w:after="80"/>
+      </w:pPr>
+      <w:r>
+        <w:rPr>
+          <w:rFonts w:ascii="Calibri" w:hAnsi="Calibri"/>
+          <w:b/>
+          <w:color w:val="065F46"/>
+          <w:sz w:val="28"/>
+        </w:rPr>
+        <w:t>4. Detalhamento do Modelo SaaS (Assinatura Recorrente — Clinix Cloud)</w:t>
+      </w:r>
+    </w:p>
+    <w:p>
+      <w:pPr>
+        <w:spacing w:after="80" w:line="276" w:lineRule="auto"/>
+      </w:pPr>
+      <w:r>
+        <w:rPr>
+          <w:rFonts w:ascii="Calibri" w:hAnsi="Calibri"/>
+          <w:color w:val="0F172A"/>
+          <w:sz w:val="20"/>
+        </w:rPr>
+        <w:t>Para a cliente que busca previsibilidade e zero desembolso inicial:</w:t>
+      </w:r>
+    </w:p>
+    <w:p>
+      <w:pPr>
+        <w:pStyle w:val="ListBullet"/>
+        <w:spacing w:after="60" w:line="276" w:lineRule="auto"/>
+      </w:pPr>
+      <w:r>
+        <w:rPr>
+          <w:rFonts w:ascii="Calibri" w:hAnsi="Calibri"/>
+          <w:b/>
+          <w:color w:val="0F172A"/>
+          <w:sz w:val="20"/>
+        </w:rPr>
+        <w:t>Fase 1 — Piloto de Validação:</w:t>
+      </w:r>
+      <w:r>
+        <w:rPr>
+          <w:rFonts w:ascii="Calibri" w:hAnsi="Calibri"/>
+          <w:color w:val="0F172A"/>
+          <w:sz w:val="20"/>
+        </w:rPr>
+        <w:t xml:space="preserve"> 30 dias de uso no consultório sem qualquer custo financeiro (R$ 0,00). Em troca, feedback quinzenal e depoimento para case de sucesso.</w:t>
+      </w:r>
+    </w:p>
+    <w:p>
+      <w:pPr>
+        <w:pStyle w:val="ListBullet"/>
+        <w:spacing w:after="60" w:line="276" w:lineRule="auto"/>
+      </w:pPr>
+      <w:r>
+        <w:rPr>
+          <w:rFonts w:ascii="Calibri" w:hAnsi="Calibri"/>
+          <w:b/>
+          <w:color w:val="0F172A"/>
+          <w:sz w:val="20"/>
+        </w:rPr>
+        <w:t>Fase 2 — Mensalidade de Parceiro Fundador:</w:t>
+      </w:r>
+      <w:r>
+        <w:rPr>
+          <w:rFonts w:ascii="Calibri" w:hAnsi="Calibri"/>
+          <w:color w:val="0F172A"/>
+          <w:sz w:val="20"/>
+        </w:rPr>
+        <w:t xml:space="preserve"> R$ 97,00 a R$ 127,00 por mês (ideal: R$ 119,00/mês, fixado em contrato por 12 meses).</w:t>
+      </w:r>
+    </w:p>
+    <w:p>
+      <w:pPr>
+        <w:pStyle w:val="ListBullet"/>
+        <w:spacing w:after="60" w:line="276" w:lineRule="auto"/>
+      </w:pPr>
+      <w:r>
+        <w:rPr>
+          <w:rFonts w:ascii="Calibri" w:hAnsi="Calibri"/>
+          <w:b/>
+          <w:color w:val="0F172A"/>
+          <w:sz w:val="20"/>
+        </w:rPr>
+        <w:t>Benefício da Assinatura:</w:t>
+      </w:r>
+      <w:r>
+        <w:rPr>
+          <w:rFonts w:ascii="Calibri" w:hAnsi="Calibri"/>
+          <w:color w:val="0F172A"/>
+          <w:sz w:val="20"/>
+        </w:rPr>
+        <w:t xml:space="preserve"> Cobre 100% da hospedagem em nuvem, backup diário automático, suporte contínuo via WhatsApp e todas as melhorias lançadas ao longo do ano sem cobrança adicional.</w:t>
+      </w:r>
+    </w:p>
+    <w:p>
+      <w:pPr>
+        <w:keepNext/>
+        <w:spacing w:before="280" w:after="80"/>
+      </w:pPr>
+      <w:r>
+        <w:rPr>
+          <w:rFonts w:ascii="Calibri" w:hAnsi="Calibri"/>
+          <w:b/>
+          <w:color w:val="065F46"/>
+          <w:sz w:val="28"/>
+        </w:rPr>
+        <w:t>5. Script Completo de Apresentação das Duas Opções na Reunião</w:t>
+      </w:r>
+    </w:p>
+    <w:p>
+      <w:pPr>
+        <w:spacing w:after="80" w:line="276" w:lineRule="auto"/>
+      </w:pPr>
+      <w:r>
+        <w:rPr>
+          <w:rFonts w:ascii="Calibri" w:hAnsi="Calibri"/>
+          <w:color w:val="0F172A"/>
+          <w:sz w:val="20"/>
+        </w:rPr>
+        <w:t>Este é o roteiro completo, passo a passo, de como você deve conduzir a transição da demonstração técnica para a negociação de valores com firmeza, naturalidade e autoridade consultiva:</w:t>
+      </w:r>
+    </w:p>
+    <w:p>
+      <w:pPr>
+        <w:keepNext/>
+        <w:spacing w:before="200" w:after="60"/>
+      </w:pPr>
+      <w:r>
+        <w:rPr>
+          <w:rFonts w:ascii="Calibri" w:hAnsi="Calibri"/>
+          <w:b/>
+          <w:color w:val="059669"/>
+          <w:sz w:val="23"/>
+        </w:rPr>
+        <w:t>Momento 1: A Transição da Demonstração para os Valores</w:t>
+      </w:r>
+    </w:p>
+    <w:p>
+      <w:pPr>
+        <w:spacing w:after="80" w:line="276" w:lineRule="auto"/>
+      </w:pPr>
+      <w:r>
+        <w:rPr>
+          <w:rFonts w:ascii="Calibri" w:hAnsi="Calibri"/>
+          <w:color w:val="0F172A"/>
+          <w:sz w:val="20"/>
+        </w:rPr>
+        <w:t>Assim que terminar de mostrar a tela de relatórios e LGPD, não espere a cliente perguntar com timidez. Assuma a condução com naturalidade:</w:t>
+      </w:r>
+    </w:p>
+    <w:p>
+      <w:pPr>
+        <w:spacing w:before="80" w:after="120"/>
+        <w:ind w:left="288" w:right="288"/>
+        <w:pBdr>
+          <w:left w:val="single" w:sz="24" w:space="12" w:color="059669"/>
+        </w:pBdr>
+        <w:shd w:fill="F0FDF4"/>
+      </w:pPr>
+      <w:r>
+        <w:rPr>
+          <w:rFonts w:ascii="Calibri" w:hAnsi="Calibri"/>
+          <w:b/>
+          <w:color w:val="065F46"/>
+          <w:sz w:val="19"/>
+        </w:rPr>
+        <w:t>🗣️ Fala de Transição Suave</w:t>
+        <w:br/>
+      </w:r>
+      <w:r>
+        <w:rPr>
+          <w:rFonts w:ascii="Calibri" w:hAnsi="Calibri"/>
+          <w:i/>
+          <w:color w:val="0F172A"/>
+          <w:sz w:val="19"/>
+        </w:rPr>
+        <w:t>"Dra. [Nome], agora que vimos todo o fluxo prático — desde o agendamento em 3 cliques e o lembrete no WhatsApp até a proteção jurídica do prontuário —, quero te apresentar como nós estruturamos a contratação para o seu consultório."</w:t>
+      </w:r>
+    </w:p>
+    <w:p>
+      <w:pPr>
+        <w:keepNext/>
+        <w:spacing w:before="200" w:after="60"/>
+      </w:pPr>
+      <w:r>
+        <w:rPr>
+          <w:rFonts w:ascii="Calibri" w:hAnsi="Calibri"/>
+          <w:b/>
+          <w:color w:val="059669"/>
+          <w:sz w:val="23"/>
+        </w:rPr>
+        <w:t>Momento 2: A Apresentação das Duas Opções (A Técnica das Duas Portas)</w:t>
+      </w:r>
+    </w:p>
+    <w:p>
+      <w:pPr>
+        <w:spacing w:after="80" w:line="276" w:lineRule="auto"/>
+      </w:pPr>
+      <w:r>
+        <w:rPr>
+          <w:rFonts w:ascii="Calibri" w:hAnsi="Calibri"/>
+          <w:color w:val="0F172A"/>
+          <w:sz w:val="20"/>
+        </w:rPr>
+        <w:t>Apresente as duas alternativas de forma equilibrada, dando à cliente a sensação de controle total:</w:t>
+      </w:r>
+    </w:p>
+    <w:p>
+      <w:pPr>
+        <w:spacing w:before="80" w:after="120"/>
+        <w:ind w:left="288" w:right="288"/>
+        <w:pBdr>
+          <w:left w:val="single" w:sz="24" w:space="12" w:color="059669"/>
+        </w:pBdr>
+        <w:shd w:fill="F0FDF4"/>
+      </w:pPr>
+      <w:r>
+        <w:rPr>
+          <w:rFonts w:ascii="Calibri" w:hAnsi="Calibri"/>
+          <w:b/>
+          <w:color w:val="065F46"/>
+          <w:sz w:val="19"/>
+        </w:rPr>
+        <w:t>🗣️ Apresentação das Duas Opções Comerciais</w:t>
+        <w:br/>
+      </w:r>
+      <w:r>
+        <w:rPr>
+          <w:rFonts w:ascii="Calibri" w:hAnsi="Calibri"/>
+          <w:i/>
+          <w:color w:val="0F172A"/>
+          <w:sz w:val="19"/>
+        </w:rPr>
+        <w:t>"Para que você tenha total conforto financeiro e escolha o que melhor se adapta à gestão da sua clínica hoje, nós trabalhamos com dois formatos de contratação:</w:t>
+        <w:br/>
+        <w:br/>
+        <w:t>Opção 1 — Assinatura Leve (Plano Parceiro Fundador):</w:t>
+        <w:br/>
+        <w:t>Você não paga nenhuma taxa de desenvolvimento ou implantação. Nós liberamos 30 dias de uso piloto gratuito no seu consultório para você e sua equipe testarem na rotina real. Se você aprovar os resultados, você mantém uma mensalidade especial fixada de apenas R$ 119,00 por mês [ou R$ 97,00], que já cobre os servidores na nuvem, backups diários de segurança, suporte direto comigo e todas as novas atualizações que lançarmos, sem qualquer taxa de fidelidade ou cancelamento.</w:t>
+        <w:br/>
+        <w:br/>
+        <w:t>Opção 2 — Projeto Dedicado do Consultório (Sem Mensalidades):</w:t>
+        <w:br/>
+        <w:t>Se você prefere não ter mensalidades fixas e quer que o sistema seja um investimento próprio do consultório, nós fazemos a entrega como um projeto fechado por R$ 2.400,00. Nós dividimos esse valor em etapas conforme as entregas: 40% de entrada, 30% na validação dos seus dados e 30% após o treinamento da sua equipe. Essa opção inclui a instalação exclusiva, importação dos seus pacientes e 90 dias de garantia técnica total, sem mensalidades obrigatórias."</w:t>
+      </w:r>
+    </w:p>
+    <w:p>
+      <w:pPr>
+        <w:keepNext/>
+        <w:spacing w:before="200" w:after="60"/>
+      </w:pPr>
+      <w:r>
+        <w:rPr>
+          <w:rFonts w:ascii="Calibri" w:hAnsi="Calibri"/>
+          <w:b/>
+          <w:color w:val="059669"/>
+          <w:sz w:val="23"/>
+        </w:rPr>
+        <w:t>Momento 3: A Pergunta de Fechamento (Call to Action)</w:t>
+      </w:r>
+    </w:p>
+    <w:p>
+      <w:pPr>
+        <w:spacing w:after="80" w:line="276" w:lineRule="auto"/>
+      </w:pPr>
+      <w:r>
+        <w:rPr>
+          <w:rFonts w:ascii="Calibri" w:hAnsi="Calibri"/>
+          <w:color w:val="0F172A"/>
+          <w:sz w:val="20"/>
+        </w:rPr>
+        <w:t>Faça uma pergunta aberta e silencie para ouvir a resposta da cliente com calma:</w:t>
+      </w:r>
+    </w:p>
+    <w:p>
+      <w:pPr>
+        <w:spacing w:before="80" w:after="120"/>
+        <w:ind w:left="288" w:right="288"/>
+        <w:pBdr>
+          <w:left w:val="single" w:sz="24" w:space="12" w:color="059669"/>
+        </w:pBdr>
+        <w:shd w:fill="F0FDF4"/>
+      </w:pPr>
+      <w:r>
+        <w:rPr>
+          <w:rFonts w:ascii="Calibri" w:hAnsi="Calibri"/>
+          <w:b/>
+          <w:color w:val="065F46"/>
+          <w:sz w:val="19"/>
+        </w:rPr>
+        <w:t>🗣️ Pergunta de Fechamento Direta</w:t>
+        <w:br/>
+      </w:r>
+      <w:r>
+        <w:rPr>
+          <w:rFonts w:ascii="Calibri" w:hAnsi="Calibri"/>
+          <w:i/>
+          <w:color w:val="0F172A"/>
+          <w:sz w:val="19"/>
+        </w:rPr>
+        <w:t>"Dra. [Nome], considerando a rotina e o momento atual do seu consultório, qual desses dois formatos faz mais sentido para você começar?"</w:t>
+      </w:r>
+    </w:p>
+    <w:p>
+      <w:pPr>
+        <w:keepNext/>
+        <w:spacing w:before="200" w:after="60"/>
+      </w:pPr>
+      <w:r>
+        <w:rPr>
+          <w:rFonts w:ascii="Calibri" w:hAnsi="Calibri"/>
+          <w:b/>
+          <w:color w:val="059669"/>
+          <w:sz w:val="23"/>
+        </w:rPr>
+        <w:t>Momento 4: Como Conduzir as Respostas da Cliente</w:t>
+      </w:r>
+    </w:p>
+    <w:p>
+      <w:pPr>
+        <w:pStyle w:val="ListBullet"/>
+        <w:spacing w:after="60" w:line="276" w:lineRule="auto"/>
+      </w:pPr>
+      <w:r>
+        <w:rPr>
+          <w:rFonts w:ascii="Calibri" w:hAnsi="Calibri"/>
+          <w:b/>
+          <w:color w:val="0F172A"/>
+          <w:sz w:val="20"/>
+        </w:rPr>
+        <w:t>Cenário A (Cliente escolhe a Opção 1 - Assinatura / Piloto):</w:t>
+      </w:r>
+      <w:r>
+        <w:rPr>
+          <w:rFonts w:ascii="Calibri" w:hAnsi="Calibri"/>
+          <w:color w:val="0F172A"/>
+          <w:sz w:val="20"/>
+        </w:rPr>
+        <w:t xml:space="preserve"> 'Excelente escolha! O piloto de 30 dias é a melhor forma de você sentir o ganho de tempo sem nenhum risco. Vamos combinar o seguinte: hoje mesmo eu coleto seus horários e serviços para parametrizar o sistema, e na próxima semana fazemos uma chamada rápida de 15 minutos para você começar a usar. Combinado?'</w:t>
+      </w:r>
+    </w:p>
+    <w:p>
+      <w:pPr>
+        <w:pStyle w:val="ListBullet"/>
+        <w:spacing w:after="60" w:line="276" w:lineRule="auto"/>
+      </w:pPr>
+      <w:r>
+        <w:rPr>
+          <w:rFonts w:ascii="Calibri" w:hAnsi="Calibri"/>
+          <w:b/>
+          <w:color w:val="0F172A"/>
+          <w:sz w:val="20"/>
+        </w:rPr>
+        <w:t>Cenário B (Cliente escolhe a Opção 2 - Projeto Fechado):</w:t>
+      </w:r>
+      <w:r>
+        <w:rPr>
+          <w:rFonts w:ascii="Calibri" w:hAnsi="Calibri"/>
+          <w:color w:val="0F172A"/>
+          <w:sz w:val="20"/>
+        </w:rPr>
+        <w:t xml:space="preserve"> 'Perfeito! Essa opção é excelente para quem quer ter a ferramenta como um patrimônio da clínica. Eu vou emitir o nosso termo de projeto com o cronograma das três entregas e o detalhamento da garantia de 90 dias para formalizarmos. Podemos programar a entrada para [data de preferência dela] para iniciarmos a configuração?'</w:t>
+      </w:r>
+    </w:p>
+    <w:p>
+      <w:pPr>
+        <w:pStyle w:val="ListBullet"/>
+        <w:spacing w:after="60" w:line="276" w:lineRule="auto"/>
+      </w:pPr>
+      <w:r>
+        <w:rPr>
+          <w:rFonts w:ascii="Calibri" w:hAnsi="Calibri"/>
+          <w:b/>
+          <w:color w:val="0F172A"/>
+          <w:sz w:val="20"/>
+        </w:rPr>
+        <w:t>Cenário C (Cliente hesita e diz 'Preciso pensar um pouco'):</w:t>
+      </w:r>
+      <w:r>
+        <w:rPr>
+          <w:rFonts w:ascii="Calibri" w:hAnsi="Calibri"/>
+          <w:color w:val="0F172A"/>
+          <w:sz w:val="20"/>
+        </w:rPr>
+        <w:t xml:space="preserve"> 'Compreendo perfeitamente, Dra. [Nome]! Decisões sobre o consultório devem ser tomadas com tranquilidade. Para você não precisar tomar nenhuma decisão financeira hoje, o que acha de aproveitarmos os 30 dias de piloto gratuito da Opção 1? Você usa o sistema na prática durante este mês, vê como ele reduz as faltas e, no final dos 30 dias, você decide com calma se prefere continuar na assinatura ou converter para o projeto fechado. O que acha?'</w:t>
+      </w:r>
+    </w:p>
+    <w:p>
+      <w:pPr>
+        <w:keepNext/>
+        <w:spacing w:before="280" w:after="80"/>
+      </w:pPr>
+      <w:r>
+        <w:rPr>
+          <w:rFonts w:ascii="Calibri" w:hAnsi="Calibri"/>
+          <w:b/>
+          <w:color w:val="065F46"/>
+          <w:sz w:val="28"/>
+        </w:rPr>
+        <w:t>6. Guia Completo de Respostas para Objeções de Preço e Modelo</w:t>
+      </w:r>
+    </w:p>
+    <w:tbl>
+      <w:tblPr>
+        <w:tblW w:type="auto" w:w="0"/>
+        <w:jc w:val="center"/>
+        <w:tblLayout w:type="fixed"/>
+        <w:tblLook w:firstColumn="1" w:firstRow="1" w:lastColumn="0" w:lastRow="0" w:noHBand="0" w:noVBand="1" w:val="04A0"/>
+      </w:tblPr>
+      <w:tblGrid>
+        <w:gridCol w:w="4896"/>
+        <w:gridCol w:w="4896"/>
       </w:tblGrid>
       <w:tr>
         <w:tc>
@@ -362,7 +1583,7 @@
                 <w:color w:val="FFFFFF"/>
                 <w:sz w:val="18"/>
               </w:rPr>
-              <w:t>Risco do Modelo Fechado (Venda Única)</w:t>
+              <w:t>Situação / Objeção da Cliente</w:t>
             </w:r>
           </w:p>
         </w:tc>
@@ -384,7 +1605,7 @@
                 <w:color w:val="FFFFFF"/>
                 <w:sz w:val="18"/>
               </w:rPr>
-              <w:t>Impacto Negativo Prático</w:t>
+              <w:t>Como Conduzir a Resposta com Firmeza</w:t>
             </w:r>
           </w:p>
         </w:tc>
@@ -408,7 +1629,7 @@
                 <w:color w:val="0F172A"/>
                 <w:sz w:val="18"/>
               </w:rPr>
-              <w:t>Trabalho Não Remunerado</w:t>
+              <w:t>No Modelo Fechado: 'Achei R$ 2.400 pesado para pagar agora'</w:t>
             </w:r>
           </w:p>
         </w:tc>
@@ -429,7 +1650,7 @@
                 <w:color w:val="475569"/>
                 <w:sz w:val="18"/>
               </w:rPr>
-              <w:t>Sistemas de saúde exigem manutenção, backups e suporte. Cobrar uma vez só obriga o desenvolvedor a prestar suporte contínuo de graça nos meses seguintes.</w:t>
+              <w:t>Compreendo perfeitamente! É exatamente por isso que nós temos a Opção 1 de Assinatura. Você não desembolsa absolutamente nada agora, ganha 30 dias de piloto gratuito e depois mantém apenas R$ 119,00 por mês, que é menos que o valor de uma única consulta particular da sua clínica.</w:t>
             </w:r>
           </w:p>
         </w:tc>
@@ -453,7 +1674,7 @@
                 <w:color w:val="0F172A"/>
                 <w:sz w:val="18"/>
               </w:rPr>
-              <w:t>Insegurança da Cliente</w:t>
+              <w:t>No Modelo Fechado: 'E se eu quiser colocar mais telas ou recursos depois?'</w:t>
             </w:r>
           </w:p>
         </w:tc>
@@ -474,7 +1695,7 @@
                 <w:color w:val="475569"/>
                 <w:sz w:val="18"/>
               </w:rPr>
-              <w:t>Desembolsar R$ 2.000 ou R$ 3.000 à vista por uma solução em validação gera atrito alto e receio de risco financeiro.</w:t>
+              <w:t>O sistema já entrega todo o fluxo essencial validado. Caso você queira módulos customizados específicos no futuro (como teleconsulta ou convênios), podemos orçar por hora de desenvolvimento (R$ 70/h) ou incluir em um pacote opcional de sustentação mensal.</w:t>
             </w:r>
           </w:p>
         </w:tc>
@@ -498,7 +1719,7 @@
                 <w:color w:val="0F172A"/>
                 <w:sz w:val="18"/>
               </w:rPr>
-              <w:t>Bloqueio de Evolução</w:t>
+              <w:t>No Modelo SaaS: 'Não gosto da ideia de pagar mensalidade pra sempre'</w:t>
             </w:r>
           </w:p>
         </w:tc>
@@ -519,130 +1740,7 @@
                 <w:color w:val="475569"/>
                 <w:sz w:val="18"/>
               </w:rPr>
-              <w:t>O software fica congelado no tempo na versão vendida, inviabilizando o modelo de plataforma que atende múltiplos consultórios.</w:t>
-            </w:r>
-          </w:p>
-        </w:tc>
-      </w:tr>
-    </w:tbl>
-    <w:p>
-      <w:pPr>
-        <w:spacing w:after="120"/>
-      </w:pPr>
-    </w:p>
-    <w:p>
-      <w:pPr>
-        <w:keepNext/>
-        <w:spacing w:before="280" w:after="80"/>
-      </w:pPr>
-      <w:r>
-        <w:rPr>
-          <w:rFonts w:ascii="Calibri" w:hAnsi="Calibri"/>
-          <w:b/>
-          <w:color w:val="065F46"/>
-          <w:sz w:val="28"/>
-        </w:rPr>
-        <w:t>3. Benchmark de Mercado (Preços Praticados no Brasil)</w:t>
-      </w:r>
-    </w:p>
-    <w:p>
-      <w:pPr>
-        <w:spacing w:after="80" w:line="276" w:lineRule="auto"/>
-      </w:pPr>
-      <w:r>
-        <w:rPr>
-          <w:rFonts w:ascii="Calibri" w:hAnsi="Calibri"/>
-          <w:color w:val="0F172A"/>
-          <w:sz w:val="20"/>
-        </w:rPr>
-        <w:t>Pesquisa de mercado comparando soluções concorrentes para profissionais autônomos e pequenas clínicas:</w:t>
-      </w:r>
-    </w:p>
-    <w:tbl>
-      <w:tblPr>
-        <w:tblW w:type="auto" w:w="0"/>
-        <w:jc w:val="center"/>
-        <w:tblLayout w:type="fixed"/>
-        <w:tblLook w:firstColumn="1" w:firstRow="1" w:lastColumn="0" w:lastRow="0" w:noHBand="0" w:noVBand="1" w:val="04A0"/>
-      </w:tblPr>
-      <w:tblGrid>
-        <w:gridCol w:w="3216"/>
-        <w:gridCol w:w="3216"/>
-        <w:gridCol w:w="3216"/>
-      </w:tblGrid>
-      <w:tr>
-        <w:tc>
-          <w:tcPr>
-            <w:tcW w:type="dxa" w:w="2880"/>
-            <w:shd w:fill="065F46"/>
-            <w:tcMar>
-              <w:top w:w="100" w:type="dxa"/>
-              <w:bottom w:w="100" w:type="dxa"/>
-              <w:left w:w="100" w:type="dxa"/>
-              <w:right w:w="100" w:type="dxa"/>
-            </w:tcMar>
-          </w:tcPr>
-          <w:p>
-            <w:pPr>
-              <w:jc w:val="left"/>
-            </w:pPr>
-            <w:r>
-              <w:rPr>
-                <w:b/>
-                <w:color w:val="FFFFFF"/>
-                <w:sz w:val="18"/>
-              </w:rPr>
-              <w:t>Categoria de Sistema</w:t>
-            </w:r>
-          </w:p>
-        </w:tc>
-        <w:tc>
-          <w:tcPr>
-            <w:tcW w:type="dxa" w:w="4896"/>
-            <w:shd w:fill="065F46"/>
-            <w:tcMar>
-              <w:top w:w="100" w:type="dxa"/>
-              <w:bottom w:w="100" w:type="dxa"/>
-              <w:left w:w="100" w:type="dxa"/>
-              <w:right w:w="100" w:type="dxa"/>
-            </w:tcMar>
-          </w:tcPr>
-          <w:p>
-            <w:pPr>
-              <w:jc w:val="left"/>
-            </w:pPr>
-            <w:r>
-              <w:rPr>
-                <w:b/>
-                <w:color w:val="FFFFFF"/>
-                <w:sz w:val="18"/>
-              </w:rPr>
-              <w:t>Funcionalidades Oferecidas</w:t>
-            </w:r>
-          </w:p>
-        </w:tc>
-        <w:tc>
-          <w:tcPr>
-            <w:tcW w:type="dxa" w:w="2016"/>
-            <w:shd w:fill="065F46"/>
-            <w:tcMar>
-              <w:top w:w="100" w:type="dxa"/>
-              <w:bottom w:w="100" w:type="dxa"/>
-              <w:left w:w="100" w:type="dxa"/>
-              <w:right w:w="100" w:type="dxa"/>
-            </w:tcMar>
-          </w:tcPr>
-          <w:p>
-            <w:pPr>
-              <w:jc w:val="center"/>
-            </w:pPr>
-            <w:r>
-              <w:rPr>
-                <w:b/>
-                <w:color w:val="FFFFFF"/>
-                <w:sz w:val="18"/>
-              </w:rPr>
-              <w:t>Mensalidade Média</w:t>
+              <w:t>Sem problemas! A grande vantagem do nosso projeto é a flexibilidade. Nós podemos formalizar a entrega como Projeto Fechado por R$ 2.400,00 (divididos em 3 etapas de entrega), com 90 dias de garantia técnica inclusa e sem qualquer cobrança mensal obrigatória.</w:t>
             </w:r>
           </w:p>
         </w:tc>
@@ -650,83 +1748,7 @@
       <w:tr>
         <w:tc>
           <w:tcPr>
-            <w:tcW w:type="dxa" w:w="2880"/>
-            <w:shd w:fill="F8FAFC"/>
-            <w:tcMar>
-              <w:top w:w="80" w:type="dxa"/>
-              <w:bottom w:w="80" w:type="dxa"/>
-              <w:left w:w="100" w:type="dxa"/>
-              <w:right w:w="100" w:type="dxa"/>
-            </w:tcMar>
-          </w:tcPr>
-          <w:p>
-            <w:pPr>
-              <w:jc w:val="left"/>
-            </w:pPr>
-            <w:r>
-              <w:rPr>
-                <w:b/>
-                <w:color w:val="0F172A"/>
-                <w:sz w:val="18"/>
-              </w:rPr>
-              <w:t>Sistemas de Entrada (Doctoralia, iClinic básico)</w:t>
-            </w:r>
-          </w:p>
-        </w:tc>
-        <w:tc>
-          <w:tcPr>
-            <w:tcW w:type="dxa" w:w="4896"/>
-            <w:shd w:fill="F8FAFC"/>
-            <w:tcMar>
-              <w:top w:w="80" w:type="dxa"/>
-              <w:bottom w:w="80" w:type="dxa"/>
-              <w:left w:w="100" w:type="dxa"/>
-              <w:right w:w="100" w:type="dxa"/>
-            </w:tcMar>
-          </w:tcPr>
-          <w:p>
-            <w:pPr>
-              <w:jc w:val="left"/>
-            </w:pPr>
-            <w:r>
-              <w:rPr>
-                <w:color w:val="475569"/>
-                <w:sz w:val="18"/>
-              </w:rPr>
-              <w:t>Apenas agenda e prontuário simples</w:t>
-            </w:r>
-          </w:p>
-        </w:tc>
-        <w:tc>
-          <w:tcPr>
-            <w:tcW w:type="dxa" w:w="2016"/>
-            <w:shd w:fill="F8FAFC"/>
-            <w:tcMar>
-              <w:top w:w="80" w:type="dxa"/>
-              <w:bottom w:w="80" w:type="dxa"/>
-              <w:left w:w="100" w:type="dxa"/>
-              <w:right w:w="100" w:type="dxa"/>
-            </w:tcMar>
-          </w:tcPr>
-          <w:p>
-            <w:pPr>
-              <w:jc w:val="center"/>
-            </w:pPr>
-            <w:r>
-              <w:rPr>
-                <w:b/>
-                <w:color w:val="065F46"/>
-                <w:sz w:val="18"/>
-              </w:rPr>
-              <w:t>R$ 99 a R$ 149 / mês</w:t>
-            </w:r>
-          </w:p>
-        </w:tc>
-      </w:tr>
-      <w:tr>
-        <w:tc>
-          <w:tcPr>
-            <w:tcW w:type="dxa" w:w="2880"/>
+            <w:tcW w:type="dxa" w:w="3600"/>
             <w:shd w:fill="FFFFFF"/>
             <w:tcMar>
               <w:top w:w="80" w:type="dxa"/>
@@ -736,22 +1758,19 @@
             </w:tcMar>
           </w:tcPr>
           <w:p>
-            <w:pPr>
-              <w:jc w:val="left"/>
-            </w:pPr>
             <w:r>
               <w:rPr>
                 <w:b/>
                 <w:color w:val="0F172A"/>
                 <w:sz w:val="18"/>
               </w:rPr>
-              <w:t>Sistemas com WhatsApp &amp; Finanças (Zenklub Pro, Simples Dental)</w:t>
+              <w:t>Em Qualquer Modelo: 'Por que não é de graça se é projeto da faculdade?'</w:t>
             </w:r>
           </w:p>
         </w:tc>
         <w:tc>
           <w:tcPr>
-            <w:tcW w:type="dxa" w:w="4896"/>
+            <w:tcW w:type="dxa" w:w="6192"/>
             <w:shd w:fill="FFFFFF"/>
             <w:tcMar>
               <w:top w:w="80" w:type="dxa"/>
@@ -761,1005 +1780,12 @@
             </w:tcMar>
           </w:tcPr>
           <w:p>
-            <w:pPr>
-              <w:jc w:val="left"/>
-            </w:pPr>
             <w:r>
               <w:rPr>
                 <w:color w:val="475569"/>
                 <w:sz w:val="18"/>
               </w:rPr>
-              <w:t>Lembretes automáticos, histórico imutável e fluxo de caixa</w:t>
-            </w:r>
-          </w:p>
-        </w:tc>
-        <w:tc>
-          <w:tcPr>
-            <w:tcW w:type="dxa" w:w="2016"/>
-            <w:shd w:fill="FFFFFF"/>
-            <w:tcMar>
-              <w:top w:w="80" w:type="dxa"/>
-              <w:bottom w:w="80" w:type="dxa"/>
-              <w:left w:w="100" w:type="dxa"/>
-              <w:right w:w="100" w:type="dxa"/>
-            </w:tcMar>
-          </w:tcPr>
-          <w:p>
-            <w:pPr>
-              <w:jc w:val="center"/>
-            </w:pPr>
-            <w:r>
-              <w:rPr>
-                <w:b/>
-                <w:color w:val="065F46"/>
-                <w:sz w:val="18"/>
-              </w:rPr>
-              <w:t>R$ 160 a R$ 260 / mês</w:t>
-            </w:r>
-          </w:p>
-        </w:tc>
-      </w:tr>
-      <w:tr>
-        <w:tc>
-          <w:tcPr>
-            <w:tcW w:type="dxa" w:w="2880"/>
-            <w:shd w:fill="F8FAFC"/>
-            <w:tcMar>
-              <w:top w:w="80" w:type="dxa"/>
-              <w:bottom w:w="80" w:type="dxa"/>
-              <w:left w:w="100" w:type="dxa"/>
-              <w:right w:w="100" w:type="dxa"/>
-            </w:tcMar>
-          </w:tcPr>
-          <w:p>
-            <w:pPr>
-              <w:jc w:val="left"/>
-            </w:pPr>
-            <w:r>
-              <w:rPr>
-                <w:b/>
-                <w:color w:val="0F172A"/>
-                <w:sz w:val="18"/>
-              </w:rPr>
-              <w:t>Sistemas Clínicos Maiores (Feegow, Amplimed)</w:t>
-            </w:r>
-          </w:p>
-        </w:tc>
-        <w:tc>
-          <w:tcPr>
-            <w:tcW w:type="dxa" w:w="4896"/>
-            <w:shd w:fill="F8FAFC"/>
-            <w:tcMar>
-              <w:top w:w="80" w:type="dxa"/>
-              <w:bottom w:w="80" w:type="dxa"/>
-              <w:left w:w="100" w:type="dxa"/>
-              <w:right w:w="100" w:type="dxa"/>
-            </w:tcMar>
-          </w:tcPr>
-          <w:p>
-            <w:pPr>
-              <w:jc w:val="left"/>
-            </w:pPr>
-            <w:r>
-              <w:rPr>
-                <w:color w:val="475569"/>
-                <w:sz w:val="18"/>
-              </w:rPr>
-              <w:t>Faturamento TISS, salas múltiplas e recepção complexa</w:t>
-            </w:r>
-          </w:p>
-        </w:tc>
-        <w:tc>
-          <w:tcPr>
-            <w:tcW w:type="dxa" w:w="2016"/>
-            <w:shd w:fill="F8FAFC"/>
-            <w:tcMar>
-              <w:top w:w="80" w:type="dxa"/>
-              <w:bottom w:w="80" w:type="dxa"/>
-              <w:left w:w="100" w:type="dxa"/>
-              <w:right w:w="100" w:type="dxa"/>
-            </w:tcMar>
-          </w:tcPr>
-          <w:p>
-            <w:pPr>
-              <w:jc w:val="center"/>
-            </w:pPr>
-            <w:r>
-              <w:rPr>
-                <w:b/>
-                <w:color w:val="065F46"/>
-                <w:sz w:val="18"/>
-              </w:rPr>
-              <w:t>R$ 350 a R$ 600+ / mês</w:t>
-            </w:r>
-          </w:p>
-        </w:tc>
-      </w:tr>
-    </w:tbl>
-    <w:p>
-      <w:pPr>
-        <w:spacing w:after="120"/>
-      </w:pPr>
-    </w:p>
-    <w:p>
-      <w:pPr>
-        <w:keepNext/>
-        <w:spacing w:before="200" w:after="60"/>
-      </w:pPr>
-      <w:r>
-        <w:rPr>
-          <w:rFonts w:ascii="Calibri" w:hAnsi="Calibri"/>
-          <w:b/>
-          <w:color w:val="059669"/>
-          <w:sz w:val="23"/>
-        </w:rPr>
-        <w:t>Percepção de Valor e Retorno sobre o Investimento (ROI):</w:t>
-      </w:r>
-    </w:p>
-    <w:p>
-      <w:pPr>
-        <w:spacing w:after="80" w:line="276" w:lineRule="auto"/>
-      </w:pPr>
-      <w:r>
-        <w:rPr>
-          <w:rFonts w:ascii="Calibri" w:hAnsi="Calibri"/>
-          <w:color w:val="0F172A"/>
-          <w:sz w:val="20"/>
-        </w:rPr>
-        <w:t>Em consultórios particulares, o valor médio de uma única consulta varia entre R$ 150,00 e R$ 300,00. A automação de lembretes no WhatsApp comprovadamente reduz as faltas de pacientes em até 40%. Portanto, se o sistema evitar que UM ÚNICO paciente falte no mês inteiro, ele já gerou mais economia do que o custo total da mensalidade!</w:t>
-      </w:r>
-    </w:p>
-    <w:p>
-      <w:pPr>
-        <w:keepNext/>
-        <w:spacing w:before="280" w:after="80"/>
-      </w:pPr>
-      <w:r>
-        <w:rPr>
-          <w:rFonts w:ascii="Calibri" w:hAnsi="Calibri"/>
-          <w:b/>
-          <w:color w:val="065F46"/>
-          <w:sz w:val="28"/>
-        </w:rPr>
-        <w:t>4. Modelos de Precificação Recomendados</w:t>
-      </w:r>
-    </w:p>
-    <w:p>
-      <w:pPr>
-        <w:keepNext/>
-        <w:spacing w:before="200" w:after="60"/>
-      </w:pPr>
-      <w:r>
-        <w:rPr>
-          <w:rFonts w:ascii="Calibri" w:hAnsi="Calibri"/>
-          <w:b/>
-          <w:color w:val="059669"/>
-          <w:sz w:val="23"/>
-        </w:rPr>
-        <w:t>🟢 Opção A (Recomendada): O 'Plano Parceiro Fundador' (SaaS Recorrente)</w:t>
-      </w:r>
-    </w:p>
-    <w:p>
-      <w:pPr>
-        <w:spacing w:after="80" w:line="276" w:lineRule="auto"/>
-      </w:pPr>
-      <w:r>
-        <w:rPr>
-          <w:rFonts w:ascii="Calibri" w:hAnsi="Calibri"/>
-          <w:color w:val="0F172A"/>
-          <w:sz w:val="20"/>
-        </w:rPr>
-        <w:t>Este modelo foi desenhado para eliminar 100% do risco da cliente no primeiro momento e construir uma parceria de longo prazo:</w:t>
-      </w:r>
-    </w:p>
-    <w:p>
-      <w:pPr>
-        <w:pStyle w:val="ListBullet"/>
-        <w:spacing w:after="60" w:line="276" w:lineRule="auto"/>
-      </w:pPr>
-      <w:r>
-        <w:rPr>
-          <w:rFonts w:ascii="Calibri" w:hAnsi="Calibri"/>
-          <w:b/>
-          <w:color w:val="0F172A"/>
-          <w:sz w:val="20"/>
-        </w:rPr>
-        <w:t>Fase 1 — Piloto de Validação:</w:t>
-      </w:r>
-      <w:r>
-        <w:rPr>
-          <w:rFonts w:ascii="Calibri" w:hAnsi="Calibri"/>
-          <w:color w:val="0F172A"/>
-          <w:sz w:val="20"/>
-        </w:rPr>
-        <w:t xml:space="preserve"> Duração de 30 dias sem custo financeiro (R$ 0,00). Em troca, a cliente se compromete a usar na rotina real e realizar duas reuniões rápidas de feedback (quinzenais).</w:t>
-      </w:r>
-    </w:p>
-    <w:p>
-      <w:pPr>
-        <w:pStyle w:val="ListBullet"/>
-        <w:spacing w:after="60" w:line="276" w:lineRule="auto"/>
-      </w:pPr>
-      <w:r>
-        <w:rPr>
-          <w:rFonts w:ascii="Calibri" w:hAnsi="Calibri"/>
-          <w:b/>
-          <w:color w:val="0F172A"/>
-          <w:sz w:val="20"/>
-        </w:rPr>
-        <w:t>Fase 2 — Mensalidade de Parceiro Fundador:</w:t>
-      </w:r>
-      <w:r>
-        <w:rPr>
-          <w:rFonts w:ascii="Calibri" w:hAnsi="Calibri"/>
-          <w:color w:val="0F172A"/>
-          <w:sz w:val="20"/>
-        </w:rPr>
-        <w:t xml:space="preserve"> R$ 97,00 a R$ 127,00 por mês (valor fixado em contrato por 12 meses).</w:t>
-      </w:r>
-    </w:p>
-    <w:p>
-      <w:pPr>
-        <w:pStyle w:val="ListBullet"/>
-        <w:spacing w:after="60" w:line="276" w:lineRule="auto"/>
-      </w:pPr>
-      <w:r>
-        <w:rPr>
-          <w:rFonts w:ascii="Calibri" w:hAnsi="Calibri"/>
-          <w:b/>
-          <w:color w:val="0F172A"/>
-          <w:sz w:val="20"/>
-        </w:rPr>
-        <w:t>O que está incluso no valor:</w:t>
-      </w:r>
-      <w:r>
-        <w:rPr>
-          <w:rFonts w:ascii="Calibri" w:hAnsi="Calibri"/>
-          <w:color w:val="0F172A"/>
-          <w:sz w:val="20"/>
-        </w:rPr>
-        <w:t xml:space="preserve"> Acesso ilimitado ao sistema via computador, celular e tablet.</w:t>
-      </w:r>
-    </w:p>
-    <w:p>
-      <w:pPr>
-        <w:pStyle w:val="ListBullet"/>
-        <w:spacing w:after="60" w:line="276" w:lineRule="auto"/>
-      </w:pPr>
-      <w:r>
-        <w:rPr>
-          <w:rFonts w:ascii="Calibri" w:hAnsi="Calibri"/>
-          <w:color w:val="0F172A"/>
-          <w:sz w:val="20"/>
-        </w:rPr>
-        <w:t xml:space="preserve"> Suporte técnico via WhatsApp em horário comercial diretamente com você.</w:t>
-      </w:r>
-    </w:p>
-    <w:p>
-      <w:pPr>
-        <w:pStyle w:val="ListBullet"/>
-        <w:spacing w:after="60" w:line="276" w:lineRule="auto"/>
-      </w:pPr>
-      <w:r>
-        <w:rPr>
-          <w:rFonts w:ascii="Calibri" w:hAnsi="Calibri"/>
-          <w:color w:val="0F172A"/>
-          <w:sz w:val="20"/>
-        </w:rPr>
-        <w:t xml:space="preserve"> Hospedagem segura na nuvem com rotina de backup diário automático.</w:t>
-      </w:r>
-    </w:p>
-    <w:p>
-      <w:pPr>
-        <w:pStyle w:val="ListBullet"/>
-        <w:spacing w:after="60" w:line="276" w:lineRule="auto"/>
-      </w:pPr>
-      <w:r>
-        <w:rPr>
-          <w:rFonts w:ascii="Calibri" w:hAnsi="Calibri"/>
-          <w:color w:val="0F172A"/>
-          <w:sz w:val="20"/>
-        </w:rPr>
-        <w:t xml:space="preserve"> Automação de lembretes e confirmações no WhatsApp.</w:t>
-      </w:r>
-    </w:p>
-    <w:p>
-      <w:pPr>
-        <w:pStyle w:val="ListBullet"/>
-        <w:spacing w:after="60" w:line="276" w:lineRule="auto"/>
-      </w:pPr>
-      <w:r>
-        <w:rPr>
-          <w:rFonts w:ascii="Calibri" w:hAnsi="Calibri"/>
-          <w:color w:val="0F172A"/>
-          <w:sz w:val="20"/>
-        </w:rPr>
-        <w:t xml:space="preserve"> Todas as melhorias e novos módulos implementados ao longo do ano.</w:t>
-      </w:r>
-    </w:p>
-    <w:p>
-      <w:pPr>
-        <w:keepNext/>
-        <w:spacing w:before="200" w:after="60"/>
-      </w:pPr>
-      <w:r>
-        <w:rPr>
-          <w:rFonts w:ascii="Calibri" w:hAnsi="Calibri"/>
-          <w:b/>
-          <w:color w:val="059669"/>
-          <w:sz w:val="23"/>
-        </w:rPr>
-        <w:t>🔵 Opção B: Taxa de Implantação (Setup) + Mensalidade Reduzida</w:t>
-      </w:r>
-    </w:p>
-    <w:p>
-      <w:pPr>
-        <w:spacing w:after="80" w:line="276" w:lineRule="auto"/>
-      </w:pPr>
-      <w:r>
-        <w:rPr>
-          <w:rFonts w:ascii="Calibri" w:hAnsi="Calibri"/>
-          <w:color w:val="0F172A"/>
-          <w:sz w:val="20"/>
-        </w:rPr>
-        <w:t>Recomendada caso a cliente solicite que você cadastre manualmente todo o histórico antigo de pacientes ou ministre treinamento presencial para a recepção:</w:t>
-      </w:r>
-    </w:p>
-    <w:p>
-      <w:pPr>
-        <w:pStyle w:val="ListBullet"/>
-        <w:spacing w:after="60" w:line="276" w:lineRule="auto"/>
-      </w:pPr>
-      <w:r>
-        <w:rPr>
-          <w:rFonts w:ascii="Calibri" w:hAnsi="Calibri"/>
-          <w:b/>
-          <w:color w:val="0F172A"/>
-          <w:sz w:val="20"/>
-        </w:rPr>
-        <w:t>Setup Inicial (Configuração):</w:t>
-      </w:r>
-      <w:r>
-        <w:rPr>
-          <w:rFonts w:ascii="Calibri" w:hAnsi="Calibri"/>
-          <w:color w:val="0F172A"/>
-          <w:sz w:val="20"/>
-        </w:rPr>
-        <w:t xml:space="preserve"> R$ 350,00 a R$ 500,00 (pago uma única vez na contratação). Cobre parametrização da agenda, importação de cadastros e treinamento da equipe.</w:t>
-      </w:r>
-    </w:p>
-    <w:p>
-      <w:pPr>
-        <w:pStyle w:val="ListBullet"/>
-        <w:spacing w:after="60" w:line="276" w:lineRule="auto"/>
-      </w:pPr>
-      <w:r>
-        <w:rPr>
-          <w:rFonts w:ascii="Calibri" w:hAnsi="Calibri"/>
-          <w:b/>
-          <w:color w:val="0F172A"/>
-          <w:sz w:val="20"/>
-        </w:rPr>
-        <w:t>Mensalidade:</w:t>
-      </w:r>
-      <w:r>
-        <w:rPr>
-          <w:rFonts w:ascii="Calibri" w:hAnsi="Calibri"/>
-          <w:color w:val="0F172A"/>
-          <w:sz w:val="20"/>
-        </w:rPr>
-        <w:t xml:space="preserve"> R$ 79,00 a R$ 97,00 por mês. Cobre hospedagem, backups, suporte e manutenção.</w:t>
-      </w:r>
-    </w:p>
-    <w:p>
-      <w:pPr>
-        <w:keepNext/>
-        <w:spacing w:before="280" w:after="80"/>
-      </w:pPr>
-      <w:r>
-        <w:rPr>
-          <w:rFonts w:ascii="Calibri" w:hAnsi="Calibri"/>
-          <w:b/>
-          <w:color w:val="065F46"/>
-          <w:sz w:val="28"/>
-        </w:rPr>
-        <w:t>5. Custos Operacionais e Lucratividade (Unit Economics)</w:t>
-      </w:r>
-    </w:p>
-    <w:p>
-      <w:pPr>
-        <w:spacing w:after="80" w:line="276" w:lineRule="auto"/>
-      </w:pPr>
-      <w:r>
-        <w:rPr>
-          <w:rFonts w:ascii="Calibri" w:hAnsi="Calibri"/>
-          <w:color w:val="0F172A"/>
-          <w:sz w:val="20"/>
-        </w:rPr>
-        <w:t>Para sustentar a operação técnica para as primeiras clínicas, os custos de infraestrutura em nuvem são extremamente baixos:</w:t>
-      </w:r>
-    </w:p>
-    <w:tbl>
-      <w:tblPr>
-        <w:tblW w:type="auto" w:w="0"/>
-        <w:jc w:val="center"/>
-        <w:tblLayout w:type="fixed"/>
-        <w:tblLook w:firstColumn="1" w:firstRow="1" w:lastColumn="0" w:lastRow="0" w:noHBand="0" w:noVBand="1" w:val="04A0"/>
-      </w:tblPr>
-      <w:tblGrid>
-        <w:gridCol w:w="3216"/>
-        <w:gridCol w:w="3216"/>
-        <w:gridCol w:w="3216"/>
-      </w:tblGrid>
-      <w:tr>
-        <w:tc>
-          <w:tcPr>
-            <w:tcW w:type="dxa" w:w="3168"/>
-            <w:shd w:fill="065F46"/>
-            <w:tcMar>
-              <w:top w:w="100" w:type="dxa"/>
-              <w:bottom w:w="100" w:type="dxa"/>
-              <w:left w:w="100" w:type="dxa"/>
-              <w:right w:w="100" w:type="dxa"/>
-            </w:tcMar>
-          </w:tcPr>
-          <w:p>
-            <w:pPr>
-              <w:jc w:val="left"/>
-            </w:pPr>
-            <w:r>
-              <w:rPr>
-                <w:b/>
-                <w:color w:val="FFFFFF"/>
-                <w:sz w:val="18"/>
-              </w:rPr>
-              <w:t>Componente Técnico</w:t>
-            </w:r>
-          </w:p>
-        </w:tc>
-        <w:tc>
-          <w:tcPr>
-            <w:tcW w:type="dxa" w:w="4608"/>
-            <w:shd w:fill="065F46"/>
-            <w:tcMar>
-              <w:top w:w="100" w:type="dxa"/>
-              <w:bottom w:w="100" w:type="dxa"/>
-              <w:left w:w="100" w:type="dxa"/>
-              <w:right w:w="100" w:type="dxa"/>
-            </w:tcMar>
-          </w:tcPr>
-          <w:p>
-            <w:pPr>
-              <w:jc w:val="left"/>
-            </w:pPr>
-            <w:r>
-              <w:rPr>
-                <w:b/>
-                <w:color w:val="FFFFFF"/>
-                <w:sz w:val="18"/>
-              </w:rPr>
-              <w:t>Provedor / Solução Recomendada</w:t>
-            </w:r>
-          </w:p>
-        </w:tc>
-        <w:tc>
-          <w:tcPr>
-            <w:tcW w:type="dxa" w:w="2016"/>
-            <w:shd w:fill="065F46"/>
-            <w:tcMar>
-              <w:top w:w="100" w:type="dxa"/>
-              <w:bottom w:w="100" w:type="dxa"/>
-              <w:left w:w="100" w:type="dxa"/>
-              <w:right w:w="100" w:type="dxa"/>
-            </w:tcMar>
-          </w:tcPr>
-          <w:p>
-            <w:pPr>
-              <w:jc w:val="center"/>
-            </w:pPr>
-            <w:r>
-              <w:rPr>
-                <w:b/>
-                <w:color w:val="FFFFFF"/>
-                <w:sz w:val="18"/>
-              </w:rPr>
-              <w:t>Custo Mensal Estimado</w:t>
-            </w:r>
-          </w:p>
-        </w:tc>
-      </w:tr>
-      <w:tr>
-        <w:tc>
-          <w:tcPr>
-            <w:tcW w:type="dxa" w:w="3168"/>
-            <w:shd w:fill="F8FAFC"/>
-            <w:tcMar>
-              <w:top w:w="80" w:type="dxa"/>
-              <w:bottom w:w="80" w:type="dxa"/>
-              <w:left w:w="100" w:type="dxa"/>
-              <w:right w:w="100" w:type="dxa"/>
-            </w:tcMar>
-          </w:tcPr>
-          <w:p>
-            <w:pPr>
-              <w:jc w:val="left"/>
-            </w:pPr>
-            <w:r>
-              <w:rPr>
-                <w:b/>
-                <w:color w:val="0F172A"/>
-                <w:sz w:val="18"/>
-              </w:rPr>
-              <w:t>Hospedagem Front/Backend</w:t>
-            </w:r>
-          </w:p>
-        </w:tc>
-        <w:tc>
-          <w:tcPr>
-            <w:tcW w:type="dxa" w:w="4608"/>
-            <w:shd w:fill="F8FAFC"/>
-            <w:tcMar>
-              <w:top w:w="80" w:type="dxa"/>
-              <w:bottom w:w="80" w:type="dxa"/>
-              <w:left w:w="100" w:type="dxa"/>
-              <w:right w:w="100" w:type="dxa"/>
-            </w:tcMar>
-          </w:tcPr>
-          <w:p>
-            <w:pPr>
-              <w:jc w:val="left"/>
-            </w:pPr>
-            <w:r>
-              <w:rPr>
-                <w:color w:val="475569"/>
-                <w:sz w:val="18"/>
-              </w:rPr>
-              <w:t>Railway, Render, Vercel ou VPS básica (Hostinger/Hetzner)</w:t>
-            </w:r>
-          </w:p>
-        </w:tc>
-        <w:tc>
-          <w:tcPr>
-            <w:tcW w:type="dxa" w:w="2016"/>
-            <w:shd w:fill="F8FAFC"/>
-            <w:tcMar>
-              <w:top w:w="80" w:type="dxa"/>
-              <w:bottom w:w="80" w:type="dxa"/>
-              <w:left w:w="100" w:type="dxa"/>
-              <w:right w:w="100" w:type="dxa"/>
-            </w:tcMar>
-          </w:tcPr>
-          <w:p>
-            <w:pPr>
-              <w:jc w:val="center"/>
-            </w:pPr>
-            <w:r>
-              <w:rPr>
-                <w:color w:val="475569"/>
-                <w:sz w:val="18"/>
-              </w:rPr>
-              <w:t>R$ 0,00 a R$ 30,00</w:t>
-            </w:r>
-          </w:p>
-        </w:tc>
-      </w:tr>
-      <w:tr>
-        <w:tc>
-          <w:tcPr>
-            <w:tcW w:type="dxa" w:w="3168"/>
-            <w:shd w:fill="FFFFFF"/>
-            <w:tcMar>
-              <w:top w:w="80" w:type="dxa"/>
-              <w:bottom w:w="80" w:type="dxa"/>
-              <w:left w:w="100" w:type="dxa"/>
-              <w:right w:w="100" w:type="dxa"/>
-            </w:tcMar>
-          </w:tcPr>
-          <w:p>
-            <w:pPr>
-              <w:jc w:val="left"/>
-            </w:pPr>
-            <w:r>
-              <w:rPr>
-                <w:b/>
-                <w:color w:val="0F172A"/>
-                <w:sz w:val="18"/>
-              </w:rPr>
-              <w:t>Banco de Dados Relacional</w:t>
-            </w:r>
-          </w:p>
-        </w:tc>
-        <w:tc>
-          <w:tcPr>
-            <w:tcW w:type="dxa" w:w="4608"/>
-            <w:shd w:fill="FFFFFF"/>
-            <w:tcMar>
-              <w:top w:w="80" w:type="dxa"/>
-              <w:bottom w:w="80" w:type="dxa"/>
-              <w:left w:w="100" w:type="dxa"/>
-              <w:right w:w="100" w:type="dxa"/>
-            </w:tcMar>
-          </w:tcPr>
-          <w:p>
-            <w:pPr>
-              <w:jc w:val="left"/>
-            </w:pPr>
-            <w:r>
-              <w:rPr>
-                <w:color w:val="475569"/>
-                <w:sz w:val="18"/>
-              </w:rPr>
-              <w:t>Supabase, Railway ou instância MySQL na própria VPS</w:t>
-            </w:r>
-          </w:p>
-        </w:tc>
-        <w:tc>
-          <w:tcPr>
-            <w:tcW w:type="dxa" w:w="2016"/>
-            <w:shd w:fill="FFFFFF"/>
-            <w:tcMar>
-              <w:top w:w="80" w:type="dxa"/>
-              <w:bottom w:w="80" w:type="dxa"/>
-              <w:left w:w="100" w:type="dxa"/>
-              <w:right w:w="100" w:type="dxa"/>
-            </w:tcMar>
-          </w:tcPr>
-          <w:p>
-            <w:pPr>
-              <w:jc w:val="center"/>
-            </w:pPr>
-            <w:r>
-              <w:rPr>
-                <w:color w:val="475569"/>
-                <w:sz w:val="18"/>
-              </w:rPr>
-              <w:t>R$ 0,00 a R$ 25,00</w:t>
-            </w:r>
-          </w:p>
-        </w:tc>
-      </w:tr>
-      <w:tr>
-        <w:tc>
-          <w:tcPr>
-            <w:tcW w:type="dxa" w:w="3168"/>
-            <w:shd w:fill="F8FAFC"/>
-            <w:tcMar>
-              <w:top w:w="80" w:type="dxa"/>
-              <w:bottom w:w="80" w:type="dxa"/>
-              <w:left w:w="100" w:type="dxa"/>
-              <w:right w:w="100" w:type="dxa"/>
-            </w:tcMar>
-          </w:tcPr>
-          <w:p>
-            <w:pPr>
-              <w:jc w:val="left"/>
-            </w:pPr>
-            <w:r>
-              <w:rPr>
-                <w:b/>
-                <w:color w:val="0F172A"/>
-                <w:sz w:val="18"/>
-              </w:rPr>
-              <w:t>Disparos WhatsApp</w:t>
-            </w:r>
-          </w:p>
-        </w:tc>
-        <w:tc>
-          <w:tcPr>
-            <w:tcW w:type="dxa" w:w="4608"/>
-            <w:shd w:fill="F8FAFC"/>
-            <w:tcMar>
-              <w:top w:w="80" w:type="dxa"/>
-              <w:bottom w:w="80" w:type="dxa"/>
-              <w:left w:w="100" w:type="dxa"/>
-              <w:right w:w="100" w:type="dxa"/>
-            </w:tcMar>
-          </w:tcPr>
-          <w:p>
-            <w:pPr>
-              <w:jc w:val="left"/>
-            </w:pPr>
-            <w:r>
-              <w:rPr>
-                <w:color w:val="475569"/>
-                <w:sz w:val="18"/>
-              </w:rPr>
-              <w:t>Evolution API / Z-API / WhatsApp Webhook</w:t>
-            </w:r>
-          </w:p>
-        </w:tc>
-        <w:tc>
-          <w:tcPr>
-            <w:tcW w:type="dxa" w:w="2016"/>
-            <w:shd w:fill="F8FAFC"/>
-            <w:tcMar>
-              <w:top w:w="80" w:type="dxa"/>
-              <w:bottom w:w="80" w:type="dxa"/>
-              <w:left w:w="100" w:type="dxa"/>
-              <w:right w:w="100" w:type="dxa"/>
-            </w:tcMar>
-          </w:tcPr>
-          <w:p>
-            <w:pPr>
-              <w:jc w:val="center"/>
-            </w:pPr>
-            <w:r>
-              <w:rPr>
-                <w:color w:val="475569"/>
-                <w:sz w:val="18"/>
-              </w:rPr>
-              <w:t>R$ 0,00 a R$ 40,00</w:t>
-            </w:r>
-          </w:p>
-        </w:tc>
-      </w:tr>
-      <w:tr>
-        <w:tc>
-          <w:tcPr>
-            <w:tcW w:type="dxa" w:w="3168"/>
-            <w:shd w:fill="F0FDF4"/>
-            <w:tcMar>
-              <w:top w:w="80" w:type="dxa"/>
-              <w:bottom w:w="80" w:type="dxa"/>
-              <w:left w:w="100" w:type="dxa"/>
-              <w:right w:w="100" w:type="dxa"/>
-            </w:tcMar>
-          </w:tcPr>
-          <w:p>
-            <w:pPr>
-              <w:jc w:val="left"/>
-            </w:pPr>
-            <w:r>
-              <w:rPr>
-                <w:b/>
-                <w:color w:val="0F172A"/>
-                <w:sz w:val="18"/>
-              </w:rPr>
-              <w:t>Custo Total Operacional</w:t>
-            </w:r>
-          </w:p>
-        </w:tc>
-        <w:tc>
-          <w:tcPr>
-            <w:tcW w:type="dxa" w:w="4608"/>
-            <w:shd w:fill="F0FDF4"/>
-            <w:tcMar>
-              <w:top w:w="80" w:type="dxa"/>
-              <w:bottom w:w="80" w:type="dxa"/>
-              <w:left w:w="100" w:type="dxa"/>
-              <w:right w:w="100" w:type="dxa"/>
-            </w:tcMar>
-          </w:tcPr>
-          <w:p>
-            <w:pPr>
-              <w:jc w:val="left"/>
-            </w:pPr>
-            <w:r>
-              <w:rPr>
-                <w:b/>
-                <w:color w:val="0F172A"/>
-                <w:sz w:val="18"/>
-              </w:rPr>
-              <w:t>Infraestrutura consolidada para até 3 clínicas</w:t>
-            </w:r>
-          </w:p>
-        </w:tc>
-        <w:tc>
-          <w:tcPr>
-            <w:tcW w:type="dxa" w:w="2016"/>
-            <w:shd w:fill="F0FDF4"/>
-            <w:tcMar>
-              <w:top w:w="80" w:type="dxa"/>
-              <w:bottom w:w="80" w:type="dxa"/>
-              <w:left w:w="100" w:type="dxa"/>
-              <w:right w:w="100" w:type="dxa"/>
-            </w:tcMar>
-          </w:tcPr>
-          <w:p>
-            <w:pPr>
-              <w:jc w:val="center"/>
-            </w:pPr>
-            <w:r>
-              <w:rPr>
-                <w:b/>
-                <w:color w:val="0F172A"/>
-                <w:sz w:val="18"/>
-              </w:rPr>
-              <w:t>~ R$ 30,00 a R$ 50,00 / mês</w:t>
-            </w:r>
-          </w:p>
-        </w:tc>
-      </w:tr>
-    </w:tbl>
-    <w:p>
-      <w:pPr>
-        <w:spacing w:after="120"/>
-      </w:pPr>
-    </w:p>
-    <w:p>
-      <w:pPr>
-        <w:pStyle w:val="ListBullet"/>
-        <w:spacing w:after="60" w:line="276" w:lineRule="auto"/>
-      </w:pPr>
-      <w:r>
-        <w:rPr>
-          <w:rFonts w:ascii="Calibri" w:hAnsi="Calibri"/>
-          <w:b/>
-          <w:color w:val="0F172A"/>
-          <w:sz w:val="20"/>
-        </w:rPr>
-        <w:t>Margem com 1 Cliente:</w:t>
-      </w:r>
-      <w:r>
-        <w:rPr>
-          <w:rFonts w:ascii="Calibri" w:hAnsi="Calibri"/>
-          <w:color w:val="0F172A"/>
-          <w:sz w:val="20"/>
-        </w:rPr>
-        <w:t xml:space="preserve"> Cobrando R$ 119,00/mês, você cobre 100% da sua infraestrutura e já sobra lucro líquido de ~R$ 70,00 a R$ 85,00/mês.</w:t>
-      </w:r>
-    </w:p>
-    <w:p>
-      <w:pPr>
-        <w:pStyle w:val="ListBullet"/>
-        <w:spacing w:after="60" w:line="276" w:lineRule="auto"/>
-      </w:pPr>
-      <w:r>
-        <w:rPr>
-          <w:rFonts w:ascii="Calibri" w:hAnsi="Calibri"/>
-          <w:b/>
-          <w:color w:val="0F172A"/>
-          <w:sz w:val="20"/>
-        </w:rPr>
-        <w:t>Margem com 5 Clientes:</w:t>
-      </w:r>
-      <w:r>
-        <w:rPr>
-          <w:rFonts w:ascii="Calibri" w:hAnsi="Calibri"/>
-          <w:color w:val="0F172A"/>
-          <w:sz w:val="20"/>
-        </w:rPr>
-        <w:t xml:space="preserve"> O custo de servidor praticamente não aumenta. Seu faturamento sobe para R$ 595,00/mês com mais de R$ 520,00/mês de lucro líquido recorrente.</w:t>
-      </w:r>
-    </w:p>
-    <w:p>
-      <w:pPr>
-        <w:keepNext/>
-        <w:spacing w:before="280" w:after="80"/>
-      </w:pPr>
-      <w:r>
-        <w:rPr>
-          <w:rFonts w:ascii="Calibri" w:hAnsi="Calibri"/>
-          <w:b/>
-          <w:color w:val="065F46"/>
-          <w:sz w:val="28"/>
-        </w:rPr>
-        <w:t>6. Roteiro de Negociação e Apresentação da Proposta</w:t>
-      </w:r>
-    </w:p>
-    <w:p>
-      <w:pPr>
-        <w:spacing w:after="80" w:line="276" w:lineRule="auto"/>
-      </w:pPr>
-      <w:r>
-        <w:rPr>
-          <w:rFonts w:ascii="Calibri" w:hAnsi="Calibri"/>
-          <w:color w:val="0F172A"/>
-          <w:sz w:val="20"/>
-        </w:rPr>
-        <w:t>Quando a cliente perguntar: 'E quanto vai custar esse sistema?', conduza a resposta com este discurso firme e natural:</w:t>
-      </w:r>
-    </w:p>
-    <w:p>
-      <w:pPr>
-        <w:spacing w:before="80" w:after="120"/>
-        <w:ind w:left="288" w:right="288"/>
-        <w:pBdr>
-          <w:left w:val="single" w:sz="24" w:space="12" w:color="059669"/>
-        </w:pBdr>
-        <w:shd w:fill="F0FDF4"/>
-      </w:pPr>
-      <w:r>
-        <w:rPr>
-          <w:rFonts w:ascii="Calibri" w:hAnsi="Calibri"/>
-          <w:b/>
-          <w:color w:val="065F46"/>
-          <w:sz w:val="19"/>
-        </w:rPr>
-        <w:t>🗣️ Script de Apresentação da Proposta</w:t>
-        <w:br/>
-      </w:r>
-      <w:r>
-        <w:rPr>
-          <w:rFonts w:ascii="Calibri" w:hAnsi="Calibri"/>
-          <w:i/>
-          <w:color w:val="0F172A"/>
-          <w:sz w:val="19"/>
-        </w:rPr>
-        <w:t>"Hoje, os sistemas de mercado desse segmento cobram entre R$ 180 e R$ 260 por mês, além de taxas altas de instalação, e muitas vezes entregam telas pesadas e suporte impessoal.</w:t>
-        <w:br/>
-        <w:br/>
-        <w:t>Como o Clinix está em fase de implantação com profissionais selecionados, nós criamos o Programa de Parceiro Fundador:</w:t>
-        <w:br/>
-        <w:br/>
-        <w:t>1. Nós liberamos 30 dias de uso piloto sem qualquer custo no seu consultório, para você validar na prática o ganho de tempo e a redução de faltas;</w:t>
-        <w:br/>
-        <w:t>2. Após esses 30 dias, se o sistema estiver economizando seu tempo como prometido, você entra com uma mensalidade especial travada de apenas R$ 119,00 por mês [ou R$ 97,00];</w:t>
-        <w:br/>
-        <w:t>3. Esse valor cobre a hospedagem na nuvem, backups diários de segurança, suporte direto comigo e todas as novas atualizações que lançarmos, sem taxa de cancelamento ou fidelidade abusiva.</w:t>
-        <w:br/>
-        <w:br/>
-        <w:t>O que acha dessa proposta para estruturarmos o início do piloto?"</w:t>
-      </w:r>
-    </w:p>
-    <w:p>
-      <w:pPr>
-        <w:keepNext/>
-        <w:spacing w:before="280" w:after="80"/>
-      </w:pPr>
-      <w:r>
-        <w:rPr>
-          <w:rFonts w:ascii="Calibri" w:hAnsi="Calibri"/>
-          <w:b/>
-          <w:color w:val="065F46"/>
-          <w:sz w:val="28"/>
-        </w:rPr>
-        <w:t>7. Como Lidar com Objeções de Preço</w:t>
-      </w:r>
-    </w:p>
-    <w:tbl>
-      <w:tblPr>
-        <w:tblW w:type="auto" w:w="0"/>
-        <w:jc w:val="center"/>
-        <w:tblLayout w:type="fixed"/>
-        <w:tblLook w:firstColumn="1" w:firstRow="1" w:lastColumn="0" w:lastRow="0" w:noHBand="0" w:noVBand="1" w:val="04A0"/>
-      </w:tblPr>
-      <w:tblGrid>
-        <w:gridCol w:w="4824"/>
-        <w:gridCol w:w="4824"/>
-      </w:tblGrid>
-      <w:tr>
-        <w:tc>
-          <w:tcPr>
-            <w:tcW w:type="dxa" w:w="3600"/>
-            <w:shd w:fill="065F46"/>
-            <w:tcMar>
-              <w:top w:w="100" w:type="dxa"/>
-              <w:bottom w:w="100" w:type="dxa"/>
-              <w:left w:w="100" w:type="dxa"/>
-              <w:right w:w="100" w:type="dxa"/>
-            </w:tcMar>
-          </w:tcPr>
-          <w:p>
-            <w:r>
-              <w:rPr>
-                <w:b/>
-                <w:color w:val="FFFFFF"/>
-                <w:sz w:val="18"/>
-              </w:rPr>
-              <w:t>Objeção da Cliente</w:t>
-            </w:r>
-          </w:p>
-        </w:tc>
-        <w:tc>
-          <w:tcPr>
-            <w:tcW w:type="dxa" w:w="6192"/>
-            <w:shd w:fill="065F46"/>
-            <w:tcMar>
-              <w:top w:w="100" w:type="dxa"/>
-              <w:bottom w:w="100" w:type="dxa"/>
-              <w:left w:w="100" w:type="dxa"/>
-              <w:right w:w="100" w:type="dxa"/>
-            </w:tcMar>
-          </w:tcPr>
-          <w:p>
-            <w:r>
-              <w:rPr>
-                <w:b/>
-                <w:color w:val="FFFFFF"/>
-                <w:sz w:val="18"/>
-              </w:rPr>
-              <w:t>Como Responder com Segurança</w:t>
+              <w:t>O projeto acadêmico serviu para validar o rigor de engenharia com 23 testes automatizados e aprovação técnica. Para operar no seu consultório, o sistema consome servidores profissionais, rotinas diárias de backup na nuvem e suporte técnico dedicado, garantindo que os dados dos seus pacientes estejam seguros e em total conformidade com a LGPD.</w:t>
             </w:r>
           </w:p>
         </w:tc>
@@ -1783,7 +1809,7 @@
                 <w:color w:val="0F172A"/>
                 <w:sz w:val="18"/>
               </w:rPr>
-              <w:t>Por que não é de graça se é projeto de faculdade?</w:t>
+              <w:t>Achei um sistema grátis na internet</w:t>
             </w:r>
           </w:p>
         </w:tc>
@@ -1804,7 +1830,7 @@
                 <w:color w:val="475569"/>
                 <w:sz w:val="18"/>
               </w:rPr>
-              <w:t>O projeto acadêmico serviu para validar a engenharia e os 23 testes de qualidade. Para operar no seu consultório, o sistema consome servidores profissionais em nuvem, rotinas de backup diário e suporte técnico dedicado, garantindo que os dados dos seus pacientes estejam seguros e dentro da LGPD.</w:t>
+              <w:t>Sistemas gratuitos geralmente não oferecem suporte humano, não garantem backup diário dos seus dados e costumam limitar o número de pacientes cadastrados quando você mais precisa. O Clinix oferece canal direto de suporte comigo e garantia de integridade jurídica nas anotações do prontuário.</w:t>
             </w:r>
           </w:p>
         </w:tc>
@@ -1828,7 +1854,7 @@
                 <w:color w:val="0F172A"/>
                 <w:sz w:val="18"/>
               </w:rPr>
-              <w:t>Achei um sistema grátis na internet.</w:t>
+              <w:t>E se der algum problema ou bug no sistema?</w:t>
             </w:r>
           </w:p>
         </w:tc>
@@ -1849,52 +1875,7 @@
                 <w:color w:val="475569"/>
                 <w:sz w:val="18"/>
               </w:rPr>
-              <w:t>Sistemas gratuitos geralmente não têm suporte, não realizam backup garantido e costumam monetizar vendendo anúncios ou limitando o número de pacientes quando você mais precisa. O Clinix oferece canal direto de atendimento e segurança jurídica no prontuário.</w:t>
-            </w:r>
-          </w:p>
-        </w:tc>
-      </w:tr>
-      <w:tr>
-        <w:tc>
-          <w:tcPr>
-            <w:tcW w:type="dxa" w:w="3600"/>
-            <w:shd w:fill="F8FAFC"/>
-            <w:tcMar>
-              <w:top w:w="80" w:type="dxa"/>
-              <w:bottom w:w="80" w:type="dxa"/>
-              <w:left w:w="100" w:type="dxa"/>
-              <w:right w:w="100" w:type="dxa"/>
-            </w:tcMar>
-          </w:tcPr>
-          <w:p>
-            <w:r>
-              <w:rPr>
-                <w:b/>
-                <w:color w:val="0F172A"/>
-                <w:sz w:val="18"/>
-              </w:rPr>
-              <w:t>Não quero mensalidade, prefiro pagar uma vez só.</w:t>
-            </w:r>
-          </w:p>
-        </w:tc>
-        <w:tc>
-          <w:tcPr>
-            <w:tcW w:type="dxa" w:w="6192"/>
-            <w:shd w:fill="F8FAFC"/>
-            <w:tcMar>
-              <w:top w:w="80" w:type="dxa"/>
-              <w:bottom w:w="80" w:type="dxa"/>
-              <w:left w:w="100" w:type="dxa"/>
-              <w:right w:w="100" w:type="dxa"/>
-            </w:tcMar>
-          </w:tcPr>
-          <w:p>
-            <w:r>
-              <w:rPr>
-                <w:color w:val="475569"/>
-                <w:sz w:val="18"/>
-              </w:rPr>
-              <w:t>O modelo de assinatura é a garantia de que o seu sistema nunca ficará desatualizado ou abandonado. Ele garante que a hospedagem esteja sempre ativa, com backups diários e novos recursos sendo adicionados continuamente sem custos surpresa.</w:t>
+              <w:t>No modelo de projeto fechado, você conta com 90 dias de garantia técnica total com correção prioritária sem nenhum custo. No modelo de assinatura, essa garantia e suporte são permanentes enquanto você mantiver o plano ativo.</w:t>
             </w:r>
           </w:p>
         </w:tc>
@@ -1917,7 +1898,7 @@
           <w:color w:val="065F46"/>
           <w:sz w:val="28"/>
         </w:rPr>
-        <w:t>8. Alinhamento de Expectativas e Limites do Acordo (SLA)</w:t>
+        <w:t>7. Minuta / Termo de Proposta Comercial (Pronto para Preenchimento)</w:t>
       </w:r>
     </w:p>
     <w:p>
@@ -1930,7 +1911,244 @@
           <w:color w:val="0F172A"/>
           <w:sz w:val="20"/>
         </w:rPr>
-        <w:t>Para garantir que a parceria seja saudável e você mantenha o foco nos estudos:</w:t>
+        <w:t>Utilize esta minuta estruturada para formalizar a contratação assim que a cliente definir a opção preferida:</w:t>
+      </w:r>
+    </w:p>
+    <w:tbl>
+      <w:tblPr>
+        <w:tblW w:type="auto" w:w="0"/>
+        <w:jc w:val="center"/>
+        <w:tblLayout w:type="fixed"/>
+        <w:tblLook w:firstColumn="1" w:firstRow="1" w:lastColumn="0" w:lastRow="0" w:noHBand="0" w:noVBand="1" w:val="04A0"/>
+      </w:tblPr>
+      <w:tblGrid>
+        <w:gridCol w:w="9792"/>
+      </w:tblGrid>
+      <w:tr>
+        <w:tc>
+          <w:tcPr>
+            <w:tcW w:type="dxa" w:w="9792"/>
+            <w:shd w:fill="F0FDF4"/>
+            <w:tcMar>
+              <w:top w:w="100" w:type="dxa"/>
+              <w:bottom w:w="100" w:type="dxa"/>
+              <w:left w:w="140" w:type="dxa"/>
+              <w:right w:w="140" w:type="dxa"/>
+            </w:tcMar>
+          </w:tcPr>
+          <w:p>
+            <w:pPr>
+              <w:jc w:val="center"/>
+            </w:pPr>
+            <w:r>
+              <w:rPr>
+                <w:rFonts w:ascii="Calibri" w:hAnsi="Calibri"/>
+                <w:b/>
+                <w:color w:val="065F46"/>
+                <w:sz w:val="22"/>
+              </w:rPr>
+              <w:t>PROPOSTA COMERCIAL &amp; TERMO DE ADESÃO — CLINIX</w:t>
+            </w:r>
+          </w:p>
+        </w:tc>
+      </w:tr>
+      <w:tr>
+        <w:tc>
+          <w:tcPr>
+            <w:tcW w:type="dxa" w:w="9792"/>
+            <w:shd w:fill="F8FAFC"/>
+            <w:tcMar>
+              <w:top w:w="100" w:type="dxa"/>
+              <w:bottom w:w="100" w:type="dxa"/>
+              <w:left w:w="140" w:type="dxa"/>
+              <w:right w:w="140" w:type="dxa"/>
+            </w:tcMar>
+          </w:tcPr>
+          <w:p>
+            <w:pPr>
+              <w:jc w:val="left"/>
+            </w:pPr>
+            <w:r>
+              <w:rPr>
+                <w:rFonts w:ascii="Calibri" w:hAnsi="Calibri"/>
+                <w:b w:val="0"/>
+                <w:color w:val="0F172A"/>
+                <w:sz w:val="18"/>
+              </w:rPr>
+              <w:t>1. IDENTIFICAÇÃO DAS PARTES</w:t>
+              <w:br/>
+              <w:t>CONTRATADA: Davi Felinto — Desenvolvedor de Software (Brasília/DF)</w:t>
+              <w:br/>
+              <w:t>CONTRATANTE: [Nome da Clínica / Profissional de Saúde]</w:t>
+              <w:br/>
+              <w:t>CNPJ/CPF: [Número do Documento] • Telefone: [Número] • E-mail: [E-mail]</w:t>
+            </w:r>
+          </w:p>
+        </w:tc>
+      </w:tr>
+      <w:tr>
+        <w:tc>
+          <w:tcPr>
+            <w:tcW w:type="dxa" w:w="9792"/>
+            <w:shd w:fill="FFFFFF"/>
+            <w:tcMar>
+              <w:top w:w="100" w:type="dxa"/>
+              <w:bottom w:w="100" w:type="dxa"/>
+              <w:left w:w="140" w:type="dxa"/>
+              <w:right w:w="140" w:type="dxa"/>
+            </w:tcMar>
+          </w:tcPr>
+          <w:p>
+            <w:pPr>
+              <w:jc w:val="left"/>
+            </w:pPr>
+            <w:r>
+              <w:rPr>
+                <w:rFonts w:ascii="Calibri" w:hAnsi="Calibri"/>
+                <w:b w:val="0"/>
+                <w:color w:val="0F172A"/>
+                <w:sz w:val="18"/>
+              </w:rPr>
+              <w:t>2. OBJETO DO SERVIÇO</w:t>
+              <w:br/>
+              <w:t>Implantação e disponibilização do sistema Clinix, contemplando os módulos: (1) Agenda Clínica Anti-Conflito; (2) Base de Pacientes (LGPD); (3) Prontuário com Histórico Imutável de Versões; (4) Notificações WhatsApp; (5) Controle Financeiro.</w:t>
+            </w:r>
+          </w:p>
+        </w:tc>
+      </w:tr>
+      <w:tr>
+        <w:tc>
+          <w:tcPr>
+            <w:tcW w:type="dxa" w:w="9792"/>
+            <w:shd w:fill="F8FAFC"/>
+            <w:tcMar>
+              <w:top w:w="100" w:type="dxa"/>
+              <w:bottom w:w="100" w:type="dxa"/>
+              <w:left w:w="140" w:type="dxa"/>
+              <w:right w:w="140" w:type="dxa"/>
+            </w:tcMar>
+          </w:tcPr>
+          <w:p>
+            <w:pPr>
+              <w:jc w:val="left"/>
+            </w:pPr>
+            <w:r>
+              <w:rPr>
+                <w:rFonts w:ascii="Calibri" w:hAnsi="Calibri"/>
+                <w:b w:val="0"/>
+                <w:color w:val="0F172A"/>
+                <w:sz w:val="18"/>
+              </w:rPr>
+              <w:t>3. OPÇÃO DE CONTRATAÇÃO SELECIONADA (Marcar uma opção):</w:t>
+              <w:br/>
+              <w:br/>
+              <w:t>[  ] OPÇÃO A — ASSINATURA RECORRENTE (SAAS):</w:t>
+              <w:br/>
+              <w:t xml:space="preserve">    • Período Piloto: 30 dias gratuitos a partir da data de parametrização inicial.</w:t>
+              <w:br/>
+              <w:t xml:space="preserve">    • Mensalidade Pós-Piloto: R$ 119,00 / mês (fixado por 12 meses em contrato).</w:t>
+              <w:br/>
+              <w:t xml:space="preserve">    • Serviços Inclusos: Hospedagem em nuvem, backup diário, suporte WhatsApp e todas as novas atualizações.</w:t>
+              <w:br/>
+              <w:br/>
+              <w:t>[  ] OPÇÃO B — PROJETO DEDICADO DO CONSULTÓRIO (NÃO-SAAS):</w:t>
+              <w:br/>
+              <w:t xml:space="preserve">    • Valor Total do Projeto: R$ 2.400,00.</w:t>
+              <w:br/>
+              <w:t xml:space="preserve">    • Condições: 40% na entrada (R$ 960) + 30% na homologação (R$ 720) + 30% no treinamento final.</w:t>
+              <w:br/>
+              <w:t xml:space="preserve">    • Garantia Técnica: 90 dias de garantia contra bugs com suporte prioritário.</w:t>
+            </w:r>
+          </w:p>
+        </w:tc>
+      </w:tr>
+      <w:tr>
+        <w:tc>
+          <w:tcPr>
+            <w:tcW w:type="dxa" w:w="9792"/>
+            <w:shd w:fill="FFFFFF"/>
+            <w:tcMar>
+              <w:top w:w="100" w:type="dxa"/>
+              <w:bottom w:w="100" w:type="dxa"/>
+              <w:left w:w="140" w:type="dxa"/>
+              <w:right w:w="140" w:type="dxa"/>
+            </w:tcMar>
+          </w:tcPr>
+          <w:p>
+            <w:pPr>
+              <w:jc w:val="left"/>
+            </w:pPr>
+            <w:r>
+              <w:rPr>
+                <w:rFonts w:ascii="Calibri" w:hAnsi="Calibri"/>
+                <w:b w:val="0"/>
+                <w:color w:val="0F172A"/>
+                <w:sz w:val="18"/>
+              </w:rPr>
+              <w:t>4. DISPOSIÇÕES GERAIS E LGPD</w:t>
+              <w:br/>
+              <w:t>• Todos os dados de pacientes e registros clínicos pertencem 100% à CONTRATANTE.</w:t>
+              <w:br/>
+              <w:t>• Suporte técnico prestado em horário comercial (segunda a sexta, das 08h às 18h).</w:t>
+            </w:r>
+          </w:p>
+        </w:tc>
+      </w:tr>
+      <w:tr>
+        <w:tc>
+          <w:tcPr>
+            <w:tcW w:type="dxa" w:w="9792"/>
+            <w:shd w:fill="F8FAFC"/>
+            <w:tcMar>
+              <w:top w:w="100" w:type="dxa"/>
+              <w:bottom w:w="100" w:type="dxa"/>
+              <w:left w:w="140" w:type="dxa"/>
+              <w:right w:w="140" w:type="dxa"/>
+            </w:tcMar>
+          </w:tcPr>
+          <w:p>
+            <w:pPr>
+              <w:jc w:val="center"/>
+            </w:pPr>
+            <w:r>
+              <w:rPr>
+                <w:rFonts w:ascii="Calibri" w:hAnsi="Calibri"/>
+                <w:b w:val="0"/>
+                <w:color w:val="475569"/>
+                <w:sz w:val="18"/>
+              </w:rPr>
+              <w:t>Brasília/DF, _____ de ____________________ de 2026.</w:t>
+              <w:br/>
+              <w:br/>
+              <w:br/>
+              <w:t>_______________________________________            _________________________________________</w:t>
+              <w:br/>
+              <w:t xml:space="preserve">            Davi Felinto                                      Assinatura da Contratante</w:t>
+              <w:br/>
+              <w:t xml:space="preserve">         Desenvolvedor Clinix                              [Nome do Responsável / Clínica]</w:t>
+            </w:r>
+          </w:p>
+        </w:tc>
+      </w:tr>
+    </w:tbl>
+    <w:p>
+      <w:pPr>
+        <w:spacing w:after="120"/>
+      </w:pPr>
+    </w:p>
+    <w:p>
+      <w:pPr>
+        <w:keepNext/>
+        <w:spacing w:before="280" w:after="80"/>
+      </w:pPr>
+      <w:r>
+        <w:rPr>
+          <w:rFonts w:ascii="Calibri" w:hAnsi="Calibri"/>
+          <w:b/>
+          <w:color w:val="065F46"/>
+          <w:sz w:val="28"/>
+        </w:rPr>
+        <w:t>8. Checklist de Próximos Passos para o Davi</w:t>
       </w:r>
     </w:p>
     <w:p>
@@ -1945,7 +2163,7 @@
           <w:color w:val="0F172A"/>
           <w:sz w:val="20"/>
         </w:rPr>
-        <w:t>Canal e Horário de Suporte:</w:t>
+        <w:t>Antes da Reunião:</w:t>
       </w:r>
       <w:r>
         <w:rPr>
@@ -1953,7 +2171,7 @@
           <w:color w:val="0F172A"/>
           <w:sz w:val="20"/>
         </w:rPr>
-        <w:t xml:space="preserve"> Atendimento via WhatsApp em horário comercial (segunda a sexta, das 08h às 18h). Resposta para dúvidas operacionais em até 4 horas úteis; indisponibilidade tem resposta imediata.</w:t>
+        <w:t xml:space="preserve"> Imprima ou deixe aberto este documento e o Roteiro de Apresentação. Deixe o protótipo index.html em tela cheia (tecla F11).</w:t>
       </w:r>
     </w:p>
     <w:p>
@@ -1968,7 +2186,7 @@
           <w:color w:val="0F172A"/>
           <w:sz w:val="20"/>
         </w:rPr>
-        <w:t>Escopo do Sistema:</w:t>
+        <w:t>Durante a Apresentação:</w:t>
       </w:r>
       <w:r>
         <w:rPr>
@@ -1976,7 +2194,7 @@
           <w:color w:val="0F172A"/>
           <w:sz w:val="20"/>
         </w:rPr>
-        <w:t xml:space="preserve"> O plano cobre os módulos de Agenda, Cadastro de Pacientes, Prontuário Eletrônico, Controle Financeiro e Auditoria. Customizações exclusivas ou módulos fora do escopo (ex.: convênios TISS) serão orçados à parte.</w:t>
+        <w:t xml:space="preserve"> Mostre primeiro o valor prático e as telas do sistema. Quando chegar no momento dos valores, apresente com calma as duas opções usando o script do Bloco 5.</w:t>
       </w:r>
     </w:p>
     <w:p>
@@ -1991,7 +2209,7 @@
           <w:color w:val="0F172A"/>
           <w:sz w:val="20"/>
         </w:rPr>
-        <w:t>Propriedade dos Dados:</w:t>
+        <w:t>Após a Escolha:</w:t>
       </w:r>
       <w:r>
         <w:rPr>
@@ -1999,37 +2217,14 @@
           <w:color w:val="0F172A"/>
           <w:sz w:val="20"/>
         </w:rPr>
-        <w:t xml:space="preserve"> Todos os dados cadastrais, atendimentos e históricos de prontuários pertencem 100% à cliente e à clínica, podendo ser exportados a qualquer momento em conformidade com a LGPD.</w:t>
-      </w:r>
-    </w:p>
-    <w:p>
-      <w:pPr>
-        <w:pStyle w:val="ListBullet"/>
-        <w:spacing w:after="60" w:line="276" w:lineRule="auto"/>
-      </w:pPr>
-      <w:r>
-        <w:rPr>
-          <w:rFonts w:ascii="Calibri" w:hAnsi="Calibri"/>
-          <w:b/>
-          <w:color w:val="0F172A"/>
-          <w:sz w:val="20"/>
-        </w:rPr>
-        <w:t>Contrapartida de Case de Sucesso:</w:t>
-      </w:r>
-      <w:r>
-        <w:rPr>
-          <w:rFonts w:ascii="Calibri" w:hAnsi="Calibri"/>
-          <w:color w:val="0F172A"/>
-          <w:sz w:val="20"/>
-        </w:rPr>
-        <w:t xml:space="preserve"> Ao final dos 30 dias de piloto, a cliente concorda em fornecer um breve depoimento sobre os resultados obtidos (ganho de tempo e redução de faltas), autorizando a citação como case de referência.</w:t>
+        <w:t xml:space="preserve"> Preencha a Minuta da Seção 7 com os dados da clínica e combine o prazo de início (liberação do piloto de 30 dias ou início da parametrização da entrada).</w:t>
       </w:r>
     </w:p>
     <w:sectPr>
       <w:headerReference w:type="default" r:id="rId9"/>
       <w:footerReference w:type="default" r:id="rId10"/>
       <w:pgSz w:w="12240" w:h="15840"/>
-      <w:pgMar w:top="1296" w:right="1296" w:bottom="1296" w:left="1296" w:header="720" w:footer="720" w:gutter="0"/>
+      <w:pgMar w:top="1224" w:right="1224" w:bottom="1224" w:left="1224" w:header="720" w:footer="720" w:gutter="0"/>
       <w:cols w:space="720"/>
       <w:docGrid w:linePitch="360"/>
     </w:sectPr>
@@ -2059,7 +2254,7 @@
       <w:jc w:val="right"/>
     </w:pPr>
     <w:r>
-      <w:t>Clinix • Proposta de Precificação e Estratégia Comercial</w:t>
+      <w:t>Clinix • Proposta de Precificação e Estratégia Comercial (SaaS &amp; Não-SaaS)</w:t>
     </w:r>
   </w:p>
 </w:hdr>

</xml_diff>